<commit_message>
Revisi laporan: identitas Guru BK asli, kata pengantar Islami, cover dirapikan, layout dipercantik
</commit_message>
<xml_diff>
--- a/LAPORAN_FINAL/Laporan Wawancara Helper - Kelompok - Pengembangan Profesi Konseling - FINISH.docx
+++ b/LAPORAN_FINAL/Laporan Wawancara Helper - Kelompok - Pengembangan Profesi Konseling - FINISH.docx
@@ -4,17 +4,84 @@
   <w:body>
     <w:p>
       <w:pPr>
-        <w:spacing w:before="480" w:after="160" w:lineRule="auto" w:line="360"/>
+        <w:spacing w:before="0" w:after="280" w:lineRule="auto" w:line="360"/>
         <w:jc w:val="center"/>
+        <w:shd w:val="clear" w:fill="1F3A5F"/>
       </w:pPr>
       <w:r>
         <w:rPr>
           <w:rFonts w:ascii="Times New Roman" w:hAnsi="Times New Roman" w:eastAsia="Times New Roman"/>
           <w:b/>
           <w:i w:val="0"/>
-          <w:sz w:val="32"/>
+          <w:color w:val="FFFFFF"/>
+          <w:sz w:val="24"/>
+        </w:rPr>
+        <w:t>LAPORAN TUGAS MATA KULIAH PENGEMBANGAN PROFESI KONSELING</w:t>
+      </w:r>
+    </w:p>
+    <w:p>
+      <w:pPr>
+        <w:spacing w:before="360" w:after="200" w:lineRule="auto" w:line="360"/>
+        <w:jc w:val="center"/>
+        <w:pBdr>
+          <w:bottom w:val="single" w:sz="12" w:space="4" w:color="1F3A5F"/>
+        </w:pBdr>
+      </w:pPr>
+      <w:r>
+        <w:rPr>
+          <w:rFonts w:ascii="Times New Roman" w:hAnsi="Times New Roman" w:eastAsia="Times New Roman"/>
+          <w:b/>
+          <w:i w:val="0"/>
+          <w:color w:val="1F3A5F"/>
+          <w:sz w:val="36"/>
         </w:rPr>
         <w:t>LAPORAN WAWANCARA DENGAN HELPER PEMBERI LAYANAN</w:t>
+      </w:r>
+    </w:p>
+    <w:p>
+      <w:pPr>
+        <w:spacing w:before="120" w:after="400" w:lineRule="auto" w:line="360"/>
+        <w:jc w:val="center"/>
+      </w:pPr>
+      <w:r>
+        <w:rPr>
+          <w:rFonts w:ascii="Times New Roman" w:hAnsi="Times New Roman" w:eastAsia="Times New Roman"/>
+          <w:b w:val="0"/>
+          <w:i/>
+          <w:color w:val="15293F"/>
+          <w:sz w:val="25"/>
+        </w:rPr>
+        <w:t>Telaah Karakteristik dan Peran Helper pada Empat Bidang Layanan dalam Perspektif Pengembangan Profesi Konseling</w:t>
+      </w:r>
+    </w:p>
+    <w:p>
+      <w:pPr>
+        <w:spacing w:before="0" w:after="40" w:lineRule="auto" w:line="360"/>
+        <w:jc w:val="center"/>
+      </w:pPr>
+      <w:r>
+        <w:rPr>
+          <w:rFonts w:ascii="Times New Roman" w:hAnsi="Times New Roman" w:eastAsia="Times New Roman"/>
+          <w:b w:val="0"/>
+          <w:i w:val="0"/>
+          <w:sz w:val="24"/>
+        </w:rPr>
+        <w:t>Disusun untuk memenuhi tugas mata kuliah</w:t>
+      </w:r>
+    </w:p>
+    <w:p>
+      <w:pPr>
+        <w:spacing w:before="0" w:after="160" w:lineRule="auto" w:line="360"/>
+        <w:jc w:val="center"/>
+      </w:pPr>
+      <w:r>
+        <w:rPr>
+          <w:rFonts w:ascii="Times New Roman" w:hAnsi="Times New Roman" w:eastAsia="Times New Roman"/>
+          <w:b/>
+          <w:i w:val="0"/>
+          <w:sz w:val="24"/>
+        </w:rPr>
+        <w:t>Pengembangan Profesi Konseling</w:t>
       </w:r>
     </w:p>
     <w:p>
@@ -26,10 +93,177 @@
         <w:rPr>
           <w:rFonts w:ascii="Times New Roman" w:hAnsi="Times New Roman" w:eastAsia="Times New Roman"/>
           <w:b w:val="0"/>
-          <w:i/>
-          <w:sz w:val="24"/>
-        </w:rPr>
-        <w:t>Telaah Karakteristik dan Peran Helper pada Empat Bidang Layanan dalam Perspektif Pengembangan Profesi Konseling</w:t>
+          <w:i w:val="0"/>
+          <w:sz w:val="24"/>
+        </w:rPr>
+        <w:t>Dosen Pengampu: Burju Ruth, M.Pd., Kons.</w:t>
+      </w:r>
+    </w:p>
+    <w:p>
+      <w:pPr>
+        <w:spacing w:before="0" w:after="280" w:lineRule="auto" w:line="360"/>
+        <w:jc w:val="center"/>
+      </w:pPr>
+      <w:r>
+        <w:rPr>
+          <w:rFonts w:ascii="Times New Roman" w:hAnsi="Times New Roman" w:eastAsia="Times New Roman"/>
+          <w:b/>
+          <w:i w:val="0"/>
+          <w:color w:val="1F3A5F"/>
+          <w:sz w:val="26"/>
+        </w:rPr>
+        <w:t>UNIVERSITAS INDRAPRASTA PGRI</w:t>
+      </w:r>
+    </w:p>
+    <w:p>
+      <w:pPr>
+        <w:spacing w:before="0" w:after="160" w:lineRule="auto" w:line="360"/>
+        <w:jc w:val="center"/>
+      </w:pPr>
+      <w:r>
+        <w:rPr>
+          <w:rFonts w:ascii="Times New Roman" w:hAnsi="Times New Roman" w:eastAsia="Times New Roman"/>
+          <w:b/>
+          <w:i w:val="0"/>
+          <w:sz w:val="24"/>
+        </w:rPr>
+        <w:t>Disusun oleh:</w:t>
+      </w:r>
+    </w:p>
+    <w:p>
+      <w:pPr>
+        <w:spacing w:before="0" w:after="20" w:lineRule="auto" w:line="360"/>
+        <w:jc w:val="center"/>
+      </w:pPr>
+      <w:r>
+        <w:rPr>
+          <w:rFonts w:ascii="Times New Roman" w:hAnsi="Times New Roman" w:eastAsia="Times New Roman"/>
+          <w:b/>
+          <w:i w:val="0"/>
+          <w:sz w:val="25"/>
+        </w:rPr>
+        <w:t>Nurul Syifa</w:t>
+      </w:r>
+    </w:p>
+    <w:p>
+      <w:pPr>
+        <w:spacing w:before="0" w:after="160" w:lineRule="auto" w:line="360"/>
+        <w:jc w:val="center"/>
+      </w:pPr>
+      <w:r>
+        <w:rPr>
+          <w:rFonts w:ascii="Times New Roman" w:hAnsi="Times New Roman" w:eastAsia="Times New Roman"/>
+          <w:b w:val="0"/>
+          <w:i w:val="0"/>
+          <w:sz w:val="23"/>
+        </w:rPr>
+        <w:t>NIM. 202501500526</w:t>
+      </w:r>
+    </w:p>
+    <w:p>
+      <w:pPr>
+        <w:spacing w:before="0" w:after="20" w:lineRule="auto" w:line="360"/>
+        <w:jc w:val="center"/>
+      </w:pPr>
+      <w:r>
+        <w:rPr>
+          <w:rFonts w:ascii="Times New Roman" w:hAnsi="Times New Roman" w:eastAsia="Times New Roman"/>
+          <w:b/>
+          <w:i w:val="0"/>
+          <w:sz w:val="25"/>
+        </w:rPr>
+        <w:t>Lidya Ellen Febriasalsa</w:t>
+      </w:r>
+    </w:p>
+    <w:p>
+      <w:pPr>
+        <w:spacing w:before="0" w:after="160" w:lineRule="auto" w:line="360"/>
+        <w:jc w:val="center"/>
+      </w:pPr>
+      <w:r>
+        <w:rPr>
+          <w:rFonts w:ascii="Times New Roman" w:hAnsi="Times New Roman" w:eastAsia="Times New Roman"/>
+          <w:b w:val="0"/>
+          <w:i w:val="0"/>
+          <w:sz w:val="23"/>
+        </w:rPr>
+        <w:t>NIM. 202501500538</w:t>
+      </w:r>
+    </w:p>
+    <w:p>
+      <w:pPr>
+        <w:spacing w:before="0" w:after="20" w:lineRule="auto" w:line="360"/>
+        <w:jc w:val="center"/>
+      </w:pPr>
+      <w:r>
+        <w:rPr>
+          <w:rFonts w:ascii="Times New Roman" w:hAnsi="Times New Roman" w:eastAsia="Times New Roman"/>
+          <w:b/>
+          <w:i w:val="0"/>
+          <w:sz w:val="25"/>
+        </w:rPr>
+        <w:t>Balqis Sandra Lejla</w:t>
+      </w:r>
+    </w:p>
+    <w:p>
+      <w:pPr>
+        <w:spacing w:before="0" w:after="160" w:lineRule="auto" w:line="360"/>
+        <w:jc w:val="center"/>
+      </w:pPr>
+      <w:r>
+        <w:rPr>
+          <w:rFonts w:ascii="Times New Roman" w:hAnsi="Times New Roman" w:eastAsia="Times New Roman"/>
+          <w:b w:val="0"/>
+          <w:i w:val="0"/>
+          <w:sz w:val="23"/>
+        </w:rPr>
+        <w:t>NIM. 202501500525</w:t>
+      </w:r>
+    </w:p>
+    <w:p>
+      <w:pPr>
+        <w:spacing w:before="0" w:after="20" w:lineRule="auto" w:line="360"/>
+        <w:jc w:val="center"/>
+      </w:pPr>
+      <w:r>
+        <w:rPr>
+          <w:rFonts w:ascii="Times New Roman" w:hAnsi="Times New Roman" w:eastAsia="Times New Roman"/>
+          <w:b/>
+          <w:i w:val="0"/>
+          <w:sz w:val="25"/>
+        </w:rPr>
+        <w:t>Devia Zahra</w:t>
+      </w:r>
+    </w:p>
+    <w:p>
+      <w:pPr>
+        <w:spacing w:before="0" w:after="160" w:lineRule="auto" w:line="360"/>
+        <w:jc w:val="center"/>
+      </w:pPr>
+      <w:r>
+        <w:rPr>
+          <w:rFonts w:ascii="Times New Roman" w:hAnsi="Times New Roman" w:eastAsia="Times New Roman"/>
+          <w:b w:val="0"/>
+          <w:i w:val="0"/>
+          <w:sz w:val="23"/>
+        </w:rPr>
+        <w:t>NIM. 202501500511</w:t>
+      </w:r>
+    </w:p>
+    <w:p>
+      <w:pPr>
+        <w:spacing w:before="360" w:after="40" w:lineRule="auto" w:line="360"/>
+        <w:jc w:val="center"/>
+      </w:pPr>
+      <w:r>
+        <w:rPr>
+          <w:rFonts w:ascii="Times New Roman" w:hAnsi="Times New Roman" w:eastAsia="Times New Roman"/>
+          <w:b/>
+          <w:i w:val="0"/>
+          <w:color w:val="1F3A5F"/>
+          <w:sz w:val="25"/>
+        </w:rPr>
+        <w:t>PROGRAM STUDI BIMBINGAN DAN KONSELING</w:t>
       </w:r>
     </w:p>
     <w:p>
@@ -40,56 +274,12 @@
       <w:r>
         <w:rPr>
           <w:rFonts w:ascii="Times New Roman" w:hAnsi="Times New Roman" w:eastAsia="Times New Roman"/>
-          <w:b w:val="0"/>
-          <w:i w:val="0"/>
-          <w:sz w:val="24"/>
-        </w:rPr>
-        <w:t>Disusun untuk memenuhi tugas mata kuliah</w:t>
-      </w:r>
-    </w:p>
-    <w:p>
-      <w:pPr>
-        <w:spacing w:before="0" w:after="160" w:lineRule="auto" w:line="360"/>
-        <w:jc w:val="center"/>
-      </w:pPr>
-      <w:r>
-        <w:rPr>
-          <w:rFonts w:ascii="Times New Roman" w:hAnsi="Times New Roman" w:eastAsia="Times New Roman"/>
           <w:b/>
           <w:i w:val="0"/>
-          <w:sz w:val="24"/>
-        </w:rPr>
-        <w:t>Pengembangan Profesi Konseling</w:t>
-      </w:r>
-    </w:p>
-    <w:p>
-      <w:pPr>
-        <w:spacing w:before="0" w:after="400" w:lineRule="auto" w:line="360"/>
-        <w:jc w:val="center"/>
-      </w:pPr>
-      <w:r>
-        <w:rPr>
-          <w:rFonts w:ascii="Times New Roman" w:hAnsi="Times New Roman" w:eastAsia="Times New Roman"/>
-          <w:b w:val="0"/>
-          <w:i w:val="0"/>
-          <w:sz w:val="24"/>
-        </w:rPr>
-        <w:t>Dosen Pengampu: Burju Ruth, M.Pd., Kons.</w:t>
-      </w:r>
-    </w:p>
-    <w:p>
-      <w:pPr>
-        <w:spacing w:before="0" w:after="80" w:lineRule="auto" w:line="360"/>
-        <w:jc w:val="center"/>
-      </w:pPr>
-      <w:r>
-        <w:rPr>
-          <w:rFonts w:ascii="Times New Roman" w:hAnsi="Times New Roman" w:eastAsia="Times New Roman"/>
-          <w:b w:val="0"/>
-          <w:i w:val="0"/>
-          <w:sz w:val="24"/>
-        </w:rPr>
-        <w:t>Disusun oleh:</w:t>
+          <w:color w:val="1F3A5F"/>
+          <w:sz w:val="25"/>
+        </w:rPr>
+        <w:t>FAKULTAS ILMU PENDIDIKAN DAN PENGETAHUAN SOSIAL</w:t>
       </w:r>
     </w:p>
     <w:p>
@@ -100,11 +290,12 @@
       <w:r>
         <w:rPr>
           <w:rFonts w:ascii="Times New Roman" w:hAnsi="Times New Roman" w:eastAsia="Times New Roman"/>
-          <w:b w:val="0"/>
-          <w:i w:val="0"/>
-          <w:sz w:val="24"/>
-        </w:rPr>
-        <w:t>Nurul Syifa  (202501500526)</w:t>
+          <w:b/>
+          <w:i w:val="0"/>
+          <w:color w:val="1F3A5F"/>
+          <w:sz w:val="25"/>
+        </w:rPr>
+        <w:t>UNIVERSITAS INDRAPRASTA PGRI</w:t>
       </w:r>
     </w:p>
     <w:p>
@@ -115,99 +306,10 @@
       <w:r>
         <w:rPr>
           <w:rFonts w:ascii="Times New Roman" w:hAnsi="Times New Roman" w:eastAsia="Times New Roman"/>
-          <w:b w:val="0"/>
-          <w:i w:val="0"/>
-          <w:sz w:val="24"/>
-        </w:rPr>
-        <w:t>Lidya Ellen Febriasalsa  (202501500538)</w:t>
-      </w:r>
-    </w:p>
-    <w:p>
-      <w:pPr>
-        <w:spacing w:before="0" w:after="40" w:lineRule="auto" w:line="360"/>
-        <w:jc w:val="center"/>
-      </w:pPr>
-      <w:r>
-        <w:rPr>
-          <w:rFonts w:ascii="Times New Roman" w:hAnsi="Times New Roman" w:eastAsia="Times New Roman"/>
-          <w:b w:val="0"/>
-          <w:i w:val="0"/>
-          <w:sz w:val="24"/>
-        </w:rPr>
-        <w:t>Balqis Sandra Lejla  (202501500525)</w:t>
-      </w:r>
-    </w:p>
-    <w:p>
-      <w:pPr>
-        <w:spacing w:before="0" w:after="40" w:lineRule="auto" w:line="360"/>
-        <w:jc w:val="center"/>
-      </w:pPr>
-      <w:r>
-        <w:rPr>
-          <w:rFonts w:ascii="Times New Roman" w:hAnsi="Times New Roman" w:eastAsia="Times New Roman"/>
-          <w:b w:val="0"/>
-          <w:i w:val="0"/>
-          <w:sz w:val="24"/>
-        </w:rPr>
-        <w:t>Devia Zahra  (202501500511)</w:t>
-      </w:r>
-    </w:p>
-    <w:p>
-      <w:pPr>
-        <w:spacing w:before="400" w:after="40" w:lineRule="auto" w:line="360"/>
-        <w:jc w:val="center"/>
-      </w:pPr>
-      <w:r>
-        <w:rPr>
-          <w:rFonts w:ascii="Times New Roman" w:hAnsi="Times New Roman" w:eastAsia="Times New Roman"/>
           <w:b/>
           <w:i w:val="0"/>
-          <w:sz w:val="24"/>
-        </w:rPr>
-        <w:t>PROGRAM STUDI BIMBINGAN DAN KONSELING</w:t>
-      </w:r>
-    </w:p>
-    <w:p>
-      <w:pPr>
-        <w:spacing w:before="0" w:after="40" w:lineRule="auto" w:line="360"/>
-        <w:jc w:val="center"/>
-      </w:pPr>
-      <w:r>
-        <w:rPr>
-          <w:rFonts w:ascii="Times New Roman" w:hAnsi="Times New Roman" w:eastAsia="Times New Roman"/>
-          <w:b/>
-          <w:i w:val="0"/>
-          <w:sz w:val="24"/>
-        </w:rPr>
-        <w:t>FAKULTAS ILMU PENDIDIKAN DAN PENGETAHUAN SOSIAL</w:t>
-      </w:r>
-    </w:p>
-    <w:p>
-      <w:pPr>
-        <w:spacing w:before="0" w:after="40" w:lineRule="auto" w:line="360"/>
-        <w:jc w:val="center"/>
-      </w:pPr>
-      <w:r>
-        <w:rPr>
-          <w:rFonts w:ascii="Times New Roman" w:hAnsi="Times New Roman" w:eastAsia="Times New Roman"/>
-          <w:b/>
-          <w:i w:val="0"/>
-          <w:sz w:val="24"/>
-        </w:rPr>
-        <w:t>UNIVERSITAS INDRAPRASTA PGRI</w:t>
-      </w:r>
-    </w:p>
-    <w:p>
-      <w:pPr>
-        <w:spacing w:before="0" w:after="40" w:lineRule="auto" w:line="360"/>
-        <w:jc w:val="center"/>
-      </w:pPr>
-      <w:r>
-        <w:rPr>
-          <w:rFonts w:ascii="Times New Roman" w:hAnsi="Times New Roman" w:eastAsia="Times New Roman"/>
-          <w:b/>
-          <w:i w:val="0"/>
-          <w:sz w:val="24"/>
+          <w:color w:val="1F3A5F"/>
+          <w:sz w:val="25"/>
         </w:rPr>
         <w:t>2026</w:t>
       </w:r>
@@ -230,12 +332,16 @@
         <w:jc w:val="center"/>
         <w:widowControl w:val="true"/>
         <w:keepLines w:val="true"/>
+        <w:pBdr>
+          <w:bottom w:val="single" w:sz="12" w:space="4" w:color="1F3A5F"/>
+        </w:pBdr>
       </w:pPr>
       <w:r>
         <w:rPr>
           <w:rFonts w:ascii="Times New Roman" w:hAnsi="Times New Roman" w:eastAsia="Times New Roman"/>
           <w:b/>
           <w:i w:val="0"/>
+          <w:color w:val="1F3A5F"/>
           <w:sz w:val="28"/>
         </w:rPr>
         <w:t>KATA PENGANTAR</w:t>
@@ -254,7 +360,7 @@
           <w:i w:val="0"/>
           <w:sz w:val="24"/>
         </w:rPr>
-        <w:t>Puji syukur kami panjatkan ke hadirat Tuhan Yang Maha Esa atas rahmat dan karunia-Nya sehingga laporan yang berjudul "Laporan Wawancara dengan Helper Pemberi Layanan" ini dapat kami selesaikan dengan baik. Laporan ini disusun untuk memenuhi tugas mata kuliah Pengembangan Profesi Konseling pada Program Studi Bimbingan dan Konseling, Fakultas Ilmu Pendidikan dan Pengetahuan Sosial, Universitas Indraprasta PGRI.</w:t>
+        <w:t>Puji dan syukur kami panjatkan ke hadirat Allah Subhanahu wa Ta'ala atas limpahan rahmat dan karunia-Nya sehingga laporan yang berjudul "Laporan Wawancara dengan Helper Pemberi Layanan" ini dapat kami selesaikan dengan baik. Laporan ini disusun untuk memenuhi tugas mata kuliah Pengembangan Profesi Konseling pada Program Studi Bimbingan dan Konseling, Fakultas Ilmu Pendidikan dan Pengetahuan Sosial, Universitas Indraprasta PGRI.</w:t>
       </w:r>
     </w:p>
     <w:p>
@@ -345,12 +451,16 @@
         <w:pageBreakBefore/>
         <w:widowControl w:val="true"/>
         <w:keepLines w:val="true"/>
+        <w:pBdr>
+          <w:bottom w:val="single" w:sz="12" w:space="4" w:color="1F3A5F"/>
+        </w:pBdr>
       </w:pPr>
       <w:r>
         <w:rPr>
           <w:rFonts w:ascii="Times New Roman" w:hAnsi="Times New Roman" w:eastAsia="Times New Roman"/>
           <w:b/>
           <w:i w:val="0"/>
+          <w:color w:val="1F3A5F"/>
           <w:sz w:val="28"/>
         </w:rPr>
         <w:t>DAFTAR ISI</w:t>
@@ -903,7 +1013,7 @@
         </w:rPr>
         <w:t>LAMPIRAN 3: Dokumentasi Kegiatan</w:t>
         <w:tab/>
-        <w:t>3</w:t>
+        <w:t>4</w:t>
       </w:r>
     </w:p>
     <w:p>
@@ -920,6 +1030,7 @@
           <w:rFonts w:ascii="Times New Roman" w:hAnsi="Times New Roman" w:eastAsia="Times New Roman"/>
           <w:b/>
           <w:i w:val="0"/>
+          <w:color w:val="1F3A5F"/>
           <w:sz w:val="28"/>
         </w:rPr>
         <w:t>BAB I</w:t>
@@ -932,12 +1043,16 @@
         <w:jc w:val="center"/>
         <w:widowControl w:val="true"/>
         <w:keepLines w:val="true"/>
+        <w:pBdr>
+          <w:bottom w:val="single" w:sz="12" w:space="4" w:color="1F3A5F"/>
+        </w:pBdr>
       </w:pPr>
       <w:r>
         <w:rPr>
           <w:rFonts w:ascii="Times New Roman" w:hAnsi="Times New Roman" w:eastAsia="Times New Roman"/>
           <w:b/>
           <w:i w:val="0"/>
+          <w:color w:val="1F3A5F"/>
           <w:sz w:val="28"/>
         </w:rPr>
         <w:t>PENDAHULUAN</w:t>
@@ -956,6 +1071,7 @@
           <w:rFonts w:ascii="Times New Roman" w:hAnsi="Times New Roman" w:eastAsia="Times New Roman"/>
           <w:b/>
           <w:i w:val="0"/>
+          <w:color w:val="1F3A5F"/>
           <w:sz w:val="24"/>
         </w:rPr>
         <w:t>1.1 Latar Belakang</w:t>
@@ -1038,6 +1154,7 @@
           <w:rFonts w:ascii="Times New Roman" w:hAnsi="Times New Roman" w:eastAsia="Times New Roman"/>
           <w:b/>
           <w:i w:val="0"/>
+          <w:color w:val="1F3A5F"/>
           <w:sz w:val="24"/>
         </w:rPr>
         <w:t>1.2 Tujuan</w:t>
@@ -1157,6 +1274,7 @@
           <w:rFonts w:ascii="Times New Roman" w:hAnsi="Times New Roman" w:eastAsia="Times New Roman"/>
           <w:b/>
           <w:i w:val="0"/>
+          <w:color w:val="1F3A5F"/>
           <w:sz w:val="24"/>
         </w:rPr>
         <w:t>1.3 Manfaat</w:t>
@@ -1175,6 +1293,7 @@
           <w:rFonts w:ascii="Times New Roman" w:hAnsi="Times New Roman" w:eastAsia="Times New Roman"/>
           <w:b/>
           <w:i/>
+          <w:color w:val="15293F"/>
           <w:sz w:val="24"/>
         </w:rPr>
         <w:t>1.3.1 Manfaat Teoretis</w:t>
@@ -1209,6 +1328,7 @@
           <w:rFonts w:ascii="Times New Roman" w:hAnsi="Times New Roman" w:eastAsia="Times New Roman"/>
           <w:b/>
           <w:i/>
+          <w:color w:val="15293F"/>
           <w:sz w:val="24"/>
         </w:rPr>
         <w:t>1.3.2 Manfaat Praktis</w:t>
@@ -1244,6 +1364,7 @@
           <w:rFonts w:ascii="Times New Roman" w:hAnsi="Times New Roman" w:eastAsia="Times New Roman"/>
           <w:b/>
           <w:i w:val="0"/>
+          <w:color w:val="1F3A5F"/>
           <w:sz w:val="28"/>
         </w:rPr>
         <w:t>BAB II</w:t>
@@ -1256,12 +1377,16 @@
         <w:jc w:val="center"/>
         <w:widowControl w:val="true"/>
         <w:keepLines w:val="true"/>
+        <w:pBdr>
+          <w:bottom w:val="single" w:sz="12" w:space="4" w:color="1F3A5F"/>
+        </w:pBdr>
       </w:pPr>
       <w:r>
         <w:rPr>
           <w:rFonts w:ascii="Times New Roman" w:hAnsi="Times New Roman" w:eastAsia="Times New Roman"/>
           <w:b/>
           <w:i w:val="0"/>
+          <w:color w:val="1F3A5F"/>
           <w:sz w:val="28"/>
         </w:rPr>
         <w:t>LANDASAN TEORI</w:t>
@@ -1280,6 +1405,7 @@
           <w:rFonts w:ascii="Times New Roman" w:hAnsi="Times New Roman" w:eastAsia="Times New Roman"/>
           <w:b/>
           <w:i w:val="0"/>
+          <w:color w:val="1F3A5F"/>
           <w:sz w:val="24"/>
         </w:rPr>
         <w:t>2.1 Pengertian Helper</w:t>
@@ -1346,6 +1472,7 @@
           <w:rFonts w:ascii="Times New Roman" w:hAnsi="Times New Roman" w:eastAsia="Times New Roman"/>
           <w:b/>
           <w:i w:val="0"/>
+          <w:color w:val="1F3A5F"/>
           <w:sz w:val="24"/>
         </w:rPr>
         <w:t>2.2 Karakteristik Helper yang Efektif</w:t>
@@ -1380,6 +1507,7 @@
           <w:rFonts w:ascii="Times New Roman" w:hAnsi="Times New Roman" w:eastAsia="Times New Roman"/>
           <w:b/>
           <w:i/>
+          <w:color w:val="15293F"/>
           <w:sz w:val="24"/>
         </w:rPr>
         <w:t>2.2.1 Pandangan Carl Rogers</w:t>
@@ -1414,6 +1542,7 @@
           <w:rFonts w:ascii="Times New Roman" w:hAnsi="Times New Roman" w:eastAsia="Times New Roman"/>
           <w:b/>
           <w:i/>
+          <w:color w:val="15293F"/>
           <w:sz w:val="24"/>
         </w:rPr>
         <w:t>2.2.2 Pandangan Gerald Corey</w:t>
@@ -1448,6 +1577,7 @@
           <w:rFonts w:ascii="Times New Roman" w:hAnsi="Times New Roman" w:eastAsia="Times New Roman"/>
           <w:b/>
           <w:i/>
+          <w:color w:val="15293F"/>
           <w:sz w:val="24"/>
         </w:rPr>
         <w:t>2.2.3 Pandangan Lawrence Brammer</w:t>
@@ -1498,6 +1628,7 @@
           <w:rFonts w:ascii="Times New Roman" w:hAnsi="Times New Roman" w:eastAsia="Times New Roman"/>
           <w:b/>
           <w:i w:val="0"/>
+          <w:color w:val="1F3A5F"/>
           <w:sz w:val="24"/>
         </w:rPr>
         <w:t>2.3 Peran Helper dalam Layanan</w:t>
@@ -1549,6 +1680,7 @@
           <w:rFonts w:ascii="Times New Roman" w:hAnsi="Times New Roman" w:eastAsia="Times New Roman"/>
           <w:b/>
           <w:i w:val="0"/>
+          <w:color w:val="1F3A5F"/>
           <w:sz w:val="28"/>
         </w:rPr>
         <w:t>BAB III</w:t>
@@ -1561,12 +1693,16 @@
         <w:jc w:val="center"/>
         <w:widowControl w:val="true"/>
         <w:keepLines w:val="true"/>
+        <w:pBdr>
+          <w:bottom w:val="single" w:sz="12" w:space="4" w:color="1F3A5F"/>
+        </w:pBdr>
       </w:pPr>
       <w:r>
         <w:rPr>
           <w:rFonts w:ascii="Times New Roman" w:hAnsi="Times New Roman" w:eastAsia="Times New Roman"/>
           <w:b/>
           <w:i w:val="0"/>
+          <w:color w:val="1F3A5F"/>
           <w:sz w:val="28"/>
         </w:rPr>
         <w:t>METODE KEGIATAN</w:t>
@@ -1585,6 +1721,7 @@
           <w:rFonts w:ascii="Times New Roman" w:hAnsi="Times New Roman" w:eastAsia="Times New Roman"/>
           <w:b/>
           <w:i w:val="0"/>
+          <w:color w:val="1F3A5F"/>
           <w:sz w:val="24"/>
         </w:rPr>
         <w:t>3.1 Jenis Kegiatan</w:t>
@@ -1619,6 +1756,7 @@
           <w:rFonts w:ascii="Times New Roman" w:hAnsi="Times New Roman" w:eastAsia="Times New Roman"/>
           <w:b/>
           <w:i w:val="0"/>
+          <w:color w:val="1F3A5F"/>
           <w:sz w:val="24"/>
         </w:rPr>
         <w:t>3.2 Subjek Wawancara</w:t>
@@ -1651,7 +1789,7 @@
           <w:rFonts w:ascii="Times New Roman" w:hAnsi="Times New Roman" w:eastAsia="Times New Roman"/>
           <w:b w:val="0"/>
           <w:i/>
-          <w:color w:val="1F3864"/>
+          <w:color w:val="1F3A5F"/>
           <w:sz w:val="22"/>
         </w:rPr>
         <w:t>Tabel 3.1 Profil singkat subjek wawancara</w:t>
@@ -1686,7 +1824,7 @@
         <w:tc>
           <w:tcPr>
             <w:tcW w:type="dxa" w:w="1587"/>
-            <w:shd w:val="clear" w:fill="DFE6F0"/>
+            <w:shd w:val="clear" w:fill="1F3A5F"/>
           </w:tcPr>
           <w:p>
             <w:pPr>
@@ -1697,7 +1835,7 @@
                 <w:rFonts w:ascii="Times New Roman" w:hAnsi="Times New Roman" w:eastAsia="Times New Roman"/>
                 <w:b/>
                 <w:i w:val="0"/>
-                <w:color w:val="1F3864"/>
+                <w:color w:val="FFFFFF"/>
                 <w:sz w:val="22"/>
               </w:rPr>
               <w:t>Kode</w:t>
@@ -1707,7 +1845,7 @@
         <w:tc>
           <w:tcPr>
             <w:tcW w:type="dxa" w:w="1587"/>
-            <w:shd w:val="clear" w:fill="DFE6F0"/>
+            <w:shd w:val="clear" w:fill="1F3A5F"/>
           </w:tcPr>
           <w:p>
             <w:pPr>
@@ -1718,7 +1856,7 @@
                 <w:rFonts w:ascii="Times New Roman" w:hAnsi="Times New Roman" w:eastAsia="Times New Roman"/>
                 <w:b/>
                 <w:i w:val="0"/>
-                <w:color w:val="1F3864"/>
+                <w:color w:val="FFFFFF"/>
                 <w:sz w:val="22"/>
               </w:rPr>
               <w:t>Nama</w:t>
@@ -1728,7 +1866,7 @@
         <w:tc>
           <w:tcPr>
             <w:tcW w:type="dxa" w:w="1587"/>
-            <w:shd w:val="clear" w:fill="DFE6F0"/>
+            <w:shd w:val="clear" w:fill="1F3A5F"/>
           </w:tcPr>
           <w:p>
             <w:pPr>
@@ -1739,7 +1877,7 @@
                 <w:rFonts w:ascii="Times New Roman" w:hAnsi="Times New Roman" w:eastAsia="Times New Roman"/>
                 <w:b/>
                 <w:i w:val="0"/>
-                <w:color w:val="1F3864"/>
+                <w:color w:val="FFFFFF"/>
                 <w:sz w:val="22"/>
               </w:rPr>
               <w:t>Profesi</w:t>
@@ -1749,7 +1887,7 @@
         <w:tc>
           <w:tcPr>
             <w:tcW w:type="dxa" w:w="1587"/>
-            <w:shd w:val="clear" w:fill="DFE6F0"/>
+            <w:shd w:val="clear" w:fill="1F3A5F"/>
           </w:tcPr>
           <w:p>
             <w:pPr>
@@ -1760,7 +1898,7 @@
                 <w:rFonts w:ascii="Times New Roman" w:hAnsi="Times New Roman" w:eastAsia="Times New Roman"/>
                 <w:b/>
                 <w:i w:val="0"/>
-                <w:color w:val="1F3864"/>
+                <w:color w:val="FFFFFF"/>
                 <w:sz w:val="22"/>
               </w:rPr>
               <w:t>Tempat Bertugas</w:t>
@@ -1770,7 +1908,7 @@
         <w:tc>
           <w:tcPr>
             <w:tcW w:type="dxa" w:w="1587"/>
-            <w:shd w:val="clear" w:fill="DFE6F0"/>
+            <w:shd w:val="clear" w:fill="1F3A5F"/>
           </w:tcPr>
           <w:p>
             <w:pPr>
@@ -1781,7 +1919,7 @@
                 <w:rFonts w:ascii="Times New Roman" w:hAnsi="Times New Roman" w:eastAsia="Times New Roman"/>
                 <w:b/>
                 <w:i w:val="0"/>
-                <w:color w:val="1F3864"/>
+                <w:color w:val="FFFFFF"/>
                 <w:sz w:val="22"/>
               </w:rPr>
               <w:t>Pengalaman</w:t>
@@ -1896,7 +2034,7 @@
         <w:tc>
           <w:tcPr>
             <w:tcW w:type="dxa" w:w="1587"/>
-            <w:shd w:val="clear" w:fill="F3F6FB"/>
+            <w:shd w:val="clear" w:fill="F2F5FA"/>
           </w:tcPr>
           <w:p>
             <w:pPr>
@@ -1916,7 +2054,7 @@
         <w:tc>
           <w:tcPr>
             <w:tcW w:type="dxa" w:w="1587"/>
-            <w:shd w:val="clear" w:fill="F3F6FB"/>
+            <w:shd w:val="clear" w:fill="F2F5FA"/>
           </w:tcPr>
           <w:p>
             <w:pPr>
@@ -1936,7 +2074,7 @@
         <w:tc>
           <w:tcPr>
             <w:tcW w:type="dxa" w:w="1587"/>
-            <w:shd w:val="clear" w:fill="F3F6FB"/>
+            <w:shd w:val="clear" w:fill="F2F5FA"/>
           </w:tcPr>
           <w:p>
             <w:pPr>
@@ -1956,7 +2094,7 @@
         <w:tc>
           <w:tcPr>
             <w:tcW w:type="dxa" w:w="1587"/>
-            <w:shd w:val="clear" w:fill="F3F6FB"/>
+            <w:shd w:val="clear" w:fill="F2F5FA"/>
           </w:tcPr>
           <w:p>
             <w:pPr>
@@ -1976,7 +2114,7 @@
         <w:tc>
           <w:tcPr>
             <w:tcW w:type="dxa" w:w="1587"/>
-            <w:shd w:val="clear" w:fill="F3F6FB"/>
+            <w:shd w:val="clear" w:fill="F2F5FA"/>
           </w:tcPr>
           <w:p>
             <w:pPr>
@@ -2101,7 +2239,7 @@
         <w:tc>
           <w:tcPr>
             <w:tcW w:type="dxa" w:w="1587"/>
-            <w:shd w:val="clear" w:fill="F3F6FB"/>
+            <w:shd w:val="clear" w:fill="F2F5FA"/>
           </w:tcPr>
           <w:p>
             <w:pPr>
@@ -2121,7 +2259,7 @@
         <w:tc>
           <w:tcPr>
             <w:tcW w:type="dxa" w:w="1587"/>
-            <w:shd w:val="clear" w:fill="F3F6FB"/>
+            <w:shd w:val="clear" w:fill="F2F5FA"/>
           </w:tcPr>
           <w:p>
             <w:pPr>
@@ -2134,14 +2272,14 @@
                 <w:i w:val="0"/>
                 <w:sz w:val="22"/>
               </w:rPr>
-              <w:t>Ibu Fulana (nama samaran)</w:t>
+              <w:t>Elisabeth Suwartini</w:t>
             </w:r>
           </w:p>
         </w:tc>
         <w:tc>
           <w:tcPr>
             <w:tcW w:type="dxa" w:w="1587"/>
-            <w:shd w:val="clear" w:fill="F3F6FB"/>
+            <w:shd w:val="clear" w:fill="F2F5FA"/>
           </w:tcPr>
           <w:p>
             <w:pPr>
@@ -2161,7 +2299,7 @@
         <w:tc>
           <w:tcPr>
             <w:tcW w:type="dxa" w:w="1587"/>
-            <w:shd w:val="clear" w:fill="F3F6FB"/>
+            <w:shd w:val="clear" w:fill="F2F5FA"/>
           </w:tcPr>
           <w:p>
             <w:pPr>
@@ -2174,14 +2312,14 @@
                 <w:i w:val="0"/>
                 <w:sz w:val="22"/>
               </w:rPr>
-              <w:t>SMA</w:t>
+              <w:t>SMA Negeri 49 Jakarta</w:t>
             </w:r>
           </w:p>
         </w:tc>
         <w:tc>
           <w:tcPr>
             <w:tcW w:type="dxa" w:w="1587"/>
-            <w:shd w:val="clear" w:fill="F3F6FB"/>
+            <w:shd w:val="clear" w:fill="F2F5FA"/>
           </w:tcPr>
           <w:p>
             <w:pPr>
@@ -2194,7 +2332,7 @@
                 <w:i w:val="0"/>
                 <w:sz w:val="22"/>
               </w:rPr>
-              <w:t>Sekitar 30 tahun</w:t>
+              <w:t>32 tahun</w:t>
             </w:r>
           </w:p>
         </w:tc>
@@ -2218,7 +2356,7 @@
           <w:i w:val="0"/>
           <w:sz w:val="24"/>
         </w:rPr>
-        <w:t>Khusus untuk Helper D, nama yang digunakan adalah nama samaran atas permintaan narasumber. Hal ini sekaligus menjadi penerapan asas kerahasiaan yang dijunjung dalam praktik bimbingan dan konseling.</w:t>
+        <w:t>Keempat narasumber bersedia disebutkan identitasnya dalam laporan ini. Meskipun demikian, seluruh informasi yang bersifat pribadi dan menyangkut pihak yang dilayani tetap kami jaga sesuai asas kerahasiaan yang dijunjung dalam praktik bimbingan dan konseling.</w:t>
       </w:r>
     </w:p>
     <w:p>
@@ -2234,6 +2372,7 @@
           <w:rFonts w:ascii="Times New Roman" w:hAnsi="Times New Roman" w:eastAsia="Times New Roman"/>
           <w:b/>
           <w:i w:val="0"/>
+          <w:color w:val="1F3A5F"/>
           <w:sz w:val="24"/>
         </w:rPr>
         <w:t>3.3 Teknik Pengumpulan Data</w:t>
@@ -2268,6 +2407,7 @@
           <w:rFonts w:ascii="Times New Roman" w:hAnsi="Times New Roman" w:eastAsia="Times New Roman"/>
           <w:b/>
           <w:i w:val="0"/>
+          <w:color w:val="1F3A5F"/>
           <w:sz w:val="24"/>
         </w:rPr>
         <w:t>3.4 Instrumen Wawancara</w:t>
@@ -2302,6 +2442,7 @@
           <w:rFonts w:ascii="Times New Roman" w:hAnsi="Times New Roman" w:eastAsia="Times New Roman"/>
           <w:b/>
           <w:i w:val="0"/>
+          <w:color w:val="1F3A5F"/>
           <w:sz w:val="24"/>
         </w:rPr>
         <w:t>3.5 Waktu dan Tempat Kegiatan</w:t>
@@ -2337,6 +2478,7 @@
           <w:rFonts w:ascii="Times New Roman" w:hAnsi="Times New Roman" w:eastAsia="Times New Roman"/>
           <w:b/>
           <w:i w:val="0"/>
+          <w:color w:val="1F3A5F"/>
           <w:sz w:val="28"/>
         </w:rPr>
         <w:t>BAB IV</w:t>
@@ -2349,12 +2491,16 @@
         <w:jc w:val="center"/>
         <w:widowControl w:val="true"/>
         <w:keepLines w:val="true"/>
+        <w:pBdr>
+          <w:bottom w:val="single" w:sz="12" w:space="4" w:color="1F3A5F"/>
+        </w:pBdr>
       </w:pPr>
       <w:r>
         <w:rPr>
           <w:rFonts w:ascii="Times New Roman" w:hAnsi="Times New Roman" w:eastAsia="Times New Roman"/>
           <w:b/>
           <w:i w:val="0"/>
+          <w:color w:val="1F3A5F"/>
           <w:sz w:val="28"/>
         </w:rPr>
         <w:t>HASIL WAWANCARA DAN PEMBAHASAN</w:t>
@@ -2389,6 +2535,7 @@
           <w:rFonts w:ascii="Times New Roman" w:hAnsi="Times New Roman" w:eastAsia="Times New Roman"/>
           <w:b/>
           <w:i w:val="0"/>
+          <w:color w:val="1F3A5F"/>
           <w:sz w:val="24"/>
         </w:rPr>
         <w:t>4.1 Hasil Wawancara Helper A (TNI Angkatan Darat)</w:t>
@@ -2636,9 +2783,15 @@
     </w:p>
     <w:p>
       <w:pPr>
-        <w:spacing w:lineRule="auto" w:line="360" w:after="120" w:before="0"/>
+        <w:spacing w:lineRule="auto" w:line="360" w:before="80" w:after="200"/>
+        <w:ind w:left="227" w:right="113"/>
         <w:jc w:val="both"/>
         <w:widowControl w:val="true"/>
+        <w:keepLines w:val="true"/>
+        <w:shd w:val="clear" w:fill="EEF2F8"/>
+        <w:pBdr>
+          <w:left w:val="single" w:sz="24" w:space="6" w:color="1F3A5F"/>
+        </w:pBdr>
       </w:pPr>
       <w:r>
         <w:rPr>
@@ -2663,6 +2816,7 @@
           <w:rFonts w:ascii="Times New Roman" w:hAnsi="Times New Roman" w:eastAsia="Times New Roman"/>
           <w:b/>
           <w:i w:val="0"/>
+          <w:color w:val="1F3A5F"/>
           <w:sz w:val="24"/>
         </w:rPr>
         <w:t>4.2 Hasil Wawancara Helper B (Petugas Pemadam Kebakaran)</w:t>
@@ -2910,9 +3064,15 @@
     </w:p>
     <w:p>
       <w:pPr>
-        <w:spacing w:lineRule="auto" w:line="360" w:after="120" w:before="0"/>
+        <w:spacing w:lineRule="auto" w:line="360" w:before="80" w:after="200"/>
+        <w:ind w:left="227" w:right="113"/>
         <w:jc w:val="both"/>
         <w:widowControl w:val="true"/>
+        <w:keepLines w:val="true"/>
+        <w:shd w:val="clear" w:fill="EEF2F8"/>
+        <w:pBdr>
+          <w:left w:val="single" w:sz="24" w:space="6" w:color="1F3A5F"/>
+        </w:pBdr>
       </w:pPr>
       <w:r>
         <w:rPr>
@@ -2937,6 +3097,7 @@
           <w:rFonts w:ascii="Times New Roman" w:hAnsi="Times New Roman" w:eastAsia="Times New Roman"/>
           <w:b/>
           <w:i w:val="0"/>
+          <w:color w:val="1F3A5F"/>
           <w:sz w:val="24"/>
         </w:rPr>
         <w:t>4.3 Hasil Wawancara Helper C (Bidan)</w:t>
@@ -3184,9 +3345,15 @@
     </w:p>
     <w:p>
       <w:pPr>
-        <w:spacing w:lineRule="auto" w:line="360" w:after="120" w:before="0"/>
+        <w:spacing w:lineRule="auto" w:line="360" w:before="80" w:after="200"/>
+        <w:ind w:left="227" w:right="113"/>
         <w:jc w:val="both"/>
         <w:widowControl w:val="true"/>
+        <w:keepLines w:val="true"/>
+        <w:shd w:val="clear" w:fill="EEF2F8"/>
+        <w:pBdr>
+          <w:left w:val="single" w:sz="24" w:space="6" w:color="1F3A5F"/>
+        </w:pBdr>
       </w:pPr>
       <w:r>
         <w:rPr>
@@ -3211,6 +3378,7 @@
           <w:rFonts w:ascii="Times New Roman" w:hAnsi="Times New Roman" w:eastAsia="Times New Roman"/>
           <w:b/>
           <w:i w:val="0"/>
+          <w:color w:val="1F3A5F"/>
           <w:sz w:val="24"/>
         </w:rPr>
         <w:t>4.4 Hasil Wawancara Helper D (Guru Bimbingan dan Konseling)</w:t>
@@ -3229,7 +3397,7 @@
           <w:i w:val="0"/>
           <w:sz w:val="24"/>
         </w:rPr>
-        <w:t>Narasumber pada bagian ini adalah Ibu Fulana (nama samaran), guru bimbingan dan konseling di SMA, dengan pengalaman Sekitar 30 tahun. Berikut ringkasan jawaban narasumber atas lima belas butir pertanyaan.</w:t>
+        <w:t>Narasumber pada bagian ini adalah Elisabeth Suwartini, guru bimbingan dan konseling di SMA Negeri 49 Jakarta, dengan pengalaman 32 tahun. Berikut ringkasan jawaban narasumber atas lima belas butir pertanyaan.</w:t>
       </w:r>
     </w:p>
     <w:p>
@@ -3245,7 +3413,7 @@
           <w:i w:val="0"/>
           <w:sz w:val="24"/>
         </w:rPr>
-        <w:t>1. Makna profesi dan peran utama. Ibu Fulana memaknai profesi guru bimbingan dan konseling sebagai pendamping perkembangan peserta didik. Peran utamanya bukan menghukum, melainkan membantu siswa mengenali diri, menyelesaikan masalah, dan merencanakan masa depan.</w:t>
+        <w:t>1. Makna profesi dan peran utama. Ibu Elisabeth Suwartini memaknai profesi guru bimbingan dan konseling sebagai pendamping perkembangan peserta didik. Peran utamanya bukan menghukum, melainkan membantu siswa mengenali diri, menyelesaikan masalah, dan merencanakan masa depan.</w:t>
       </w:r>
     </w:p>
     <w:p>
@@ -3261,7 +3429,7 @@
           <w:i w:val="0"/>
           <w:sz w:val="24"/>
         </w:rPr>
-        <w:t>2. Perkembangan profesi dari awal hingga kini. Selama hampir tiga puluh tahun mengabdi dan kini menjelang masa pensiun, ia menyaksikan layanan bimbingan dan konseling berkembang dari peran yang sering disalahpahami menjadi layanan yang semakin diakui penting bagi kesejahteraan siswa.</w:t>
+        <w:t>2. Perkembangan profesi dari awal hingga kini. Selama 32 tahun mengabdi dan kini menjelang masa pensiun, ia menyaksikan layanan bimbingan dan konseling berkembang dari peran yang sering disalahpahami menjadi layanan yang semakin diakui penting bagi kesejahteraan siswa.</w:t>
       </w:r>
     </w:p>
     <w:p>
@@ -3458,9 +3626,15 @@
     </w:p>
     <w:p>
       <w:pPr>
-        <w:spacing w:lineRule="auto" w:line="360" w:after="120" w:before="0"/>
+        <w:spacing w:lineRule="auto" w:line="360" w:before="80" w:after="200"/>
+        <w:ind w:left="227" w:right="113"/>
         <w:jc w:val="both"/>
         <w:widowControl w:val="true"/>
+        <w:keepLines w:val="true"/>
+        <w:shd w:val="clear" w:fill="EEF2F8"/>
+        <w:pBdr>
+          <w:left w:val="single" w:sz="24" w:space="6" w:color="1F3A5F"/>
+        </w:pBdr>
       </w:pPr>
       <w:r>
         <w:rPr>
@@ -3485,6 +3659,7 @@
           <w:rFonts w:ascii="Times New Roman" w:hAnsi="Times New Roman" w:eastAsia="Times New Roman"/>
           <w:b/>
           <w:i w:val="0"/>
+          <w:color w:val="1F3A5F"/>
           <w:sz w:val="24"/>
         </w:rPr>
         <w:t>4.5 Pembahasan</w:t>
@@ -3519,6 +3694,7 @@
           <w:rFonts w:ascii="Times New Roman" w:hAnsi="Times New Roman" w:eastAsia="Times New Roman"/>
           <w:b/>
           <w:i/>
+          <w:color w:val="15293F"/>
           <w:sz w:val="24"/>
         </w:rPr>
         <w:t>4.5.1 Persamaan Hasil Wawancara</w:t>
@@ -3553,6 +3729,7 @@
           <w:rFonts w:ascii="Times New Roman" w:hAnsi="Times New Roman" w:eastAsia="Times New Roman"/>
           <w:b/>
           <w:i/>
+          <w:color w:val="15293F"/>
           <w:sz w:val="24"/>
         </w:rPr>
         <w:t>4.5.2 Perbedaan Pengalaman Helper</w:t>
@@ -3587,6 +3764,7 @@
           <w:rFonts w:ascii="Times New Roman" w:hAnsi="Times New Roman" w:eastAsia="Times New Roman"/>
           <w:b/>
           <w:i/>
+          <w:color w:val="15293F"/>
           <w:sz w:val="24"/>
         </w:rPr>
         <w:t>4.5.3 Keterampilan Kunci yang Muncul</w:t>
@@ -3621,6 +3799,7 @@
           <w:rFonts w:ascii="Times New Roman" w:hAnsi="Times New Roman" w:eastAsia="Times New Roman"/>
           <w:b/>
           <w:i/>
+          <w:color w:val="15293F"/>
           <w:sz w:val="24"/>
         </w:rPr>
         <w:t>4.5.4 Kaitan dengan Teori Helper</w:t>
@@ -3653,7 +3832,7 @@
           <w:rFonts w:ascii="Times New Roman" w:hAnsi="Times New Roman" w:eastAsia="Times New Roman"/>
           <w:b w:val="0"/>
           <w:i/>
-          <w:color w:val="1F3864"/>
+          <w:color w:val="1F3A5F"/>
           <w:sz w:val="22"/>
         </w:rPr>
         <w:t>Tabel 4.1 Ringkasan hasil wawancara empat helper</w:t>
@@ -3688,7 +3867,7 @@
         <w:tc>
           <w:tcPr>
             <w:tcW w:type="dxa" w:w="1587"/>
-            <w:shd w:val="clear" w:fill="DFE6F0"/>
+            <w:shd w:val="clear" w:fill="1F3A5F"/>
           </w:tcPr>
           <w:p>
             <w:pPr>
@@ -3699,7 +3878,7 @@
                 <w:rFonts w:ascii="Times New Roman" w:hAnsi="Times New Roman" w:eastAsia="Times New Roman"/>
                 <w:b/>
                 <w:i w:val="0"/>
-                <w:color w:val="1F3864"/>
+                <w:color w:val="FFFFFF"/>
                 <w:sz w:val="22"/>
               </w:rPr>
               <w:t>Aspek</w:t>
@@ -3709,7 +3888,7 @@
         <w:tc>
           <w:tcPr>
             <w:tcW w:type="dxa" w:w="1587"/>
-            <w:shd w:val="clear" w:fill="DFE6F0"/>
+            <w:shd w:val="clear" w:fill="1F3A5F"/>
           </w:tcPr>
           <w:p>
             <w:pPr>
@@ -3720,7 +3899,7 @@
                 <w:rFonts w:ascii="Times New Roman" w:hAnsi="Times New Roman" w:eastAsia="Times New Roman"/>
                 <w:b/>
                 <w:i w:val="0"/>
-                <w:color w:val="1F3864"/>
+                <w:color w:val="FFFFFF"/>
                 <w:sz w:val="22"/>
               </w:rPr>
               <w:t>Helper A (TNI AD)</w:t>
@@ -3730,7 +3909,7 @@
         <w:tc>
           <w:tcPr>
             <w:tcW w:type="dxa" w:w="1587"/>
-            <w:shd w:val="clear" w:fill="DFE6F0"/>
+            <w:shd w:val="clear" w:fill="1F3A5F"/>
           </w:tcPr>
           <w:p>
             <w:pPr>
@@ -3741,7 +3920,7 @@
                 <w:rFonts w:ascii="Times New Roman" w:hAnsi="Times New Roman" w:eastAsia="Times New Roman"/>
                 <w:b/>
                 <w:i w:val="0"/>
-                <w:color w:val="1F3864"/>
+                <w:color w:val="FFFFFF"/>
                 <w:sz w:val="22"/>
               </w:rPr>
               <w:t>Helper B (Pemadam)</w:t>
@@ -3751,7 +3930,7 @@
         <w:tc>
           <w:tcPr>
             <w:tcW w:type="dxa" w:w="1587"/>
-            <w:shd w:val="clear" w:fill="DFE6F0"/>
+            <w:shd w:val="clear" w:fill="1F3A5F"/>
           </w:tcPr>
           <w:p>
             <w:pPr>
@@ -3762,7 +3941,7 @@
                 <w:rFonts w:ascii="Times New Roman" w:hAnsi="Times New Roman" w:eastAsia="Times New Roman"/>
                 <w:b/>
                 <w:i w:val="0"/>
-                <w:color w:val="1F3864"/>
+                <w:color w:val="FFFFFF"/>
                 <w:sz w:val="22"/>
               </w:rPr>
               <w:t>Helper C (Bidan)</w:t>
@@ -3772,7 +3951,7 @@
         <w:tc>
           <w:tcPr>
             <w:tcW w:type="dxa" w:w="1587"/>
-            <w:shd w:val="clear" w:fill="DFE6F0"/>
+            <w:shd w:val="clear" w:fill="1F3A5F"/>
           </w:tcPr>
           <w:p>
             <w:pPr>
@@ -3783,7 +3962,7 @@
                 <w:rFonts w:ascii="Times New Roman" w:hAnsi="Times New Roman" w:eastAsia="Times New Roman"/>
                 <w:b/>
                 <w:i w:val="0"/>
-                <w:color w:val="1F3864"/>
+                <w:color w:val="FFFFFF"/>
                 <w:sz w:val="22"/>
               </w:rPr>
               <w:t>Helper D (Guru BK)</w:t>
@@ -3898,7 +4077,7 @@
         <w:tc>
           <w:tcPr>
             <w:tcW w:type="dxa" w:w="1587"/>
-            <w:shd w:val="clear" w:fill="F3F6FB"/>
+            <w:shd w:val="clear" w:fill="F2F5FA"/>
           </w:tcPr>
           <w:p>
             <w:pPr>
@@ -3918,7 +4097,7 @@
         <w:tc>
           <w:tcPr>
             <w:tcW w:type="dxa" w:w="1587"/>
-            <w:shd w:val="clear" w:fill="F3F6FB"/>
+            <w:shd w:val="clear" w:fill="F2F5FA"/>
           </w:tcPr>
           <w:p>
             <w:pPr>
@@ -3938,7 +4117,7 @@
         <w:tc>
           <w:tcPr>
             <w:tcW w:type="dxa" w:w="1587"/>
-            <w:shd w:val="clear" w:fill="F3F6FB"/>
+            <w:shd w:val="clear" w:fill="F2F5FA"/>
           </w:tcPr>
           <w:p>
             <w:pPr>
@@ -3958,7 +4137,7 @@
         <w:tc>
           <w:tcPr>
             <w:tcW w:type="dxa" w:w="1587"/>
-            <w:shd w:val="clear" w:fill="F3F6FB"/>
+            <w:shd w:val="clear" w:fill="F2F5FA"/>
           </w:tcPr>
           <w:p>
             <w:pPr>
@@ -3978,7 +4157,7 @@
         <w:tc>
           <w:tcPr>
             <w:tcW w:type="dxa" w:w="1587"/>
-            <w:shd w:val="clear" w:fill="F3F6FB"/>
+            <w:shd w:val="clear" w:fill="F2F5FA"/>
           </w:tcPr>
           <w:p>
             <w:pPr>
@@ -4103,7 +4282,7 @@
         <w:tc>
           <w:tcPr>
             <w:tcW w:type="dxa" w:w="1587"/>
-            <w:shd w:val="clear" w:fill="F3F6FB"/>
+            <w:shd w:val="clear" w:fill="F2F5FA"/>
           </w:tcPr>
           <w:p>
             <w:pPr>
@@ -4123,7 +4302,7 @@
         <w:tc>
           <w:tcPr>
             <w:tcW w:type="dxa" w:w="1587"/>
-            <w:shd w:val="clear" w:fill="F3F6FB"/>
+            <w:shd w:val="clear" w:fill="F2F5FA"/>
           </w:tcPr>
           <w:p>
             <w:pPr>
@@ -4143,7 +4322,7 @@
         <w:tc>
           <w:tcPr>
             <w:tcW w:type="dxa" w:w="1587"/>
-            <w:shd w:val="clear" w:fill="F3F6FB"/>
+            <w:shd w:val="clear" w:fill="F2F5FA"/>
           </w:tcPr>
           <w:p>
             <w:pPr>
@@ -4163,7 +4342,7 @@
         <w:tc>
           <w:tcPr>
             <w:tcW w:type="dxa" w:w="1587"/>
-            <w:shd w:val="clear" w:fill="F3F6FB"/>
+            <w:shd w:val="clear" w:fill="F2F5FA"/>
           </w:tcPr>
           <w:p>
             <w:pPr>
@@ -4183,7 +4362,7 @@
         <w:tc>
           <w:tcPr>
             <w:tcW w:type="dxa" w:w="1587"/>
-            <w:shd w:val="clear" w:fill="F3F6FB"/>
+            <w:shd w:val="clear" w:fill="F2F5FA"/>
           </w:tcPr>
           <w:p>
             <w:pPr>
@@ -4337,6 +4516,7 @@
           <w:rFonts w:ascii="Times New Roman" w:hAnsi="Times New Roman" w:eastAsia="Times New Roman"/>
           <w:b/>
           <w:i w:val="0"/>
+          <w:color w:val="1F3A5F"/>
           <w:sz w:val="28"/>
         </w:rPr>
         <w:t>BAB V</w:t>
@@ -4349,12 +4529,16 @@
         <w:jc w:val="center"/>
         <w:widowControl w:val="true"/>
         <w:keepLines w:val="true"/>
+        <w:pBdr>
+          <w:bottom w:val="single" w:sz="12" w:space="4" w:color="1F3A5F"/>
+        </w:pBdr>
       </w:pPr>
       <w:r>
         <w:rPr>
           <w:rFonts w:ascii="Times New Roman" w:hAnsi="Times New Roman" w:eastAsia="Times New Roman"/>
           <w:b/>
           <w:i w:val="0"/>
+          <w:color w:val="1F3A5F"/>
           <w:sz w:val="28"/>
         </w:rPr>
         <w:t>PENUTUP</w:t>
@@ -4373,6 +4557,7 @@
           <w:rFonts w:ascii="Times New Roman" w:hAnsi="Times New Roman" w:eastAsia="Times New Roman"/>
           <w:b/>
           <w:i w:val="0"/>
+          <w:color w:val="1F3A5F"/>
           <w:sz w:val="24"/>
         </w:rPr>
         <w:t>5.1 Kesimpulan</w:t>
@@ -4423,6 +4608,7 @@
           <w:rFonts w:ascii="Times New Roman" w:hAnsi="Times New Roman" w:eastAsia="Times New Roman"/>
           <w:b/>
           <w:i w:val="0"/>
+          <w:color w:val="1F3A5F"/>
           <w:sz w:val="24"/>
         </w:rPr>
         <w:t>5.2 Saran</w:t>
@@ -4520,12 +4706,16 @@
         <w:pageBreakBefore/>
         <w:widowControl w:val="true"/>
         <w:keepLines w:val="true"/>
+        <w:pBdr>
+          <w:bottom w:val="single" w:sz="12" w:space="4" w:color="1F3A5F"/>
+        </w:pBdr>
       </w:pPr>
       <w:r>
         <w:rPr>
           <w:rFonts w:ascii="Times New Roman" w:hAnsi="Times New Roman" w:eastAsia="Times New Roman"/>
           <w:b/>
           <w:i w:val="0"/>
+          <w:color w:val="1F3A5F"/>
           <w:sz w:val="28"/>
         </w:rPr>
         <w:t>DAFTAR PUSTAKA</w:t>
@@ -4658,12 +4848,16 @@
         <w:pageBreakBefore/>
         <w:widowControl w:val="true"/>
         <w:keepLines w:val="true"/>
+        <w:pBdr>
+          <w:bottom w:val="single" w:sz="12" w:space="4" w:color="1F3A5F"/>
+        </w:pBdr>
       </w:pPr>
       <w:r>
         <w:rPr>
           <w:rFonts w:ascii="Times New Roman" w:hAnsi="Times New Roman" w:eastAsia="Times New Roman"/>
           <w:b/>
           <w:i w:val="0"/>
+          <w:color w:val="1F3A5F"/>
           <w:sz w:val="28"/>
         </w:rPr>
         <w:t>LAMPIRAN 1: DAFTAR PERTANYAAN WAWANCARA</w:t>
@@ -4948,12 +5142,16 @@
         <w:pageBreakBefore/>
         <w:widowControl w:val="true"/>
         <w:keepLines w:val="true"/>
+        <w:pBdr>
+          <w:bottom w:val="single" w:sz="12" w:space="4" w:color="1F3A5F"/>
+        </w:pBdr>
       </w:pPr>
       <w:r>
         <w:rPr>
           <w:rFonts w:ascii="Times New Roman" w:hAnsi="Times New Roman" w:eastAsia="Times New Roman"/>
           <w:b/>
           <w:i w:val="0"/>
+          <w:color w:val="1F3A5F"/>
           <w:sz w:val="28"/>
         </w:rPr>
         <w:t>LAMPIRAN 2: TRANSKRIP WAWANCARA</w:t>
@@ -4972,6 +5170,7 @@
           <w:rFonts w:ascii="Times New Roman" w:hAnsi="Times New Roman" w:eastAsia="Times New Roman"/>
           <w:b/>
           <w:i w:val="0"/>
+          <w:color w:val="1F3A5F"/>
           <w:sz w:val="24"/>
         </w:rPr>
         <w:t>Transkrip Helper A: Lukman Hidayat (TNI Angkatan Darat)</w:t>
@@ -5470,6 +5669,7 @@
           <w:rFonts w:ascii="Times New Roman" w:hAnsi="Times New Roman" w:eastAsia="Times New Roman"/>
           <w:b/>
           <w:i w:val="0"/>
+          <w:color w:val="1F3A5F"/>
           <w:sz w:val="24"/>
         </w:rPr>
         <w:t>Transkrip Helper B: Rinno (Petugas Pemadam Kebakaran)</w:t>
@@ -5968,6 +6168,7 @@
           <w:rFonts w:ascii="Times New Roman" w:hAnsi="Times New Roman" w:eastAsia="Times New Roman"/>
           <w:b/>
           <w:i w:val="0"/>
+          <w:color w:val="1F3A5F"/>
           <w:sz w:val="24"/>
         </w:rPr>
         <w:t>Transkrip Helper C: Priska Ayu Anjastari (Bidan)</w:t>
@@ -6466,9 +6667,10 @@
           <w:rFonts w:ascii="Times New Roman" w:hAnsi="Times New Roman" w:eastAsia="Times New Roman"/>
           <w:b/>
           <w:i w:val="0"/>
-          <w:sz w:val="24"/>
-        </w:rPr>
-        <w:t>Transkrip Helper D: Ibu Fulana (nama samaran) (Guru Bimbingan dan Konseling)</w:t>
+          <w:color w:val="1F3A5F"/>
+          <w:sz w:val="24"/>
+        </w:rPr>
+        <w:t>Transkrip Helper D: Elisabeth Suwartini (Guru Bimbingan dan Konseling)</w:t>
       </w:r>
     </w:p>
     <w:p>
@@ -6500,7 +6702,7 @@
           <w:i w:val="0"/>
           <w:sz w:val="24"/>
         </w:rPr>
-        <w:t>Ibu Fulana memaknai profesi guru bimbingan dan konseling sebagai pendamping perkembangan peserta didik. Peran utamanya bukan menghukum, melainkan membantu siswa mengenali diri, menyelesaikan masalah, dan merencanakan masa depan.</w:t>
+        <w:t>Ibu Elisabeth Suwartini memaknai profesi guru bimbingan dan konseling sebagai pendamping perkembangan peserta didik. Peran utamanya bukan menghukum, melainkan membantu siswa mengenali diri, menyelesaikan masalah, dan merencanakan masa depan.</w:t>
       </w:r>
     </w:p>
     <w:p>
@@ -6532,7 +6734,7 @@
           <w:i w:val="0"/>
           <w:sz w:val="24"/>
         </w:rPr>
-        <w:t>Selama hampir tiga puluh tahun mengabdi dan kini menjelang masa pensiun, ia menyaksikan layanan bimbingan dan konseling berkembang dari peran yang sering disalahpahami menjadi layanan yang semakin diakui penting bagi kesejahteraan siswa.</w:t>
+        <w:t>Selama 32 tahun mengabdi dan kini menjelang masa pensiun, ia menyaksikan layanan bimbingan dan konseling berkembang dari peran yang sering disalahpahami menjadi layanan yang semakin diakui penting bagi kesejahteraan siswa.</w:t>
       </w:r>
     </w:p>
     <w:p>
@@ -6959,12 +7161,16 @@
         <w:pageBreakBefore/>
         <w:widowControl w:val="true"/>
         <w:keepLines w:val="true"/>
+        <w:pBdr>
+          <w:bottom w:val="single" w:sz="12" w:space="4" w:color="1F3A5F"/>
+        </w:pBdr>
       </w:pPr>
       <w:r>
         <w:rPr>
           <w:rFonts w:ascii="Times New Roman" w:hAnsi="Times New Roman" w:eastAsia="Times New Roman"/>
           <w:b/>
           <w:i w:val="0"/>
+          <w:color w:val="1F3A5F"/>
           <w:sz w:val="28"/>
         </w:rPr>
         <w:t>LAMPIRAN 3: DOKUMENTASI KEGIATAN</w:t>
@@ -7207,7 +7413,7 @@
           <w:i/>
           <w:sz w:val="22"/>
         </w:rPr>
-        <w:t>Dokumentasi wawancara dengan Ibu Fulana (nama samaran) (Guru Bimbingan dan Konseling)</w:t>
+        <w:t>Dokumentasi wawancara dengan Elisabeth Suwartini (Guru Bimbingan dan Konseling)</w:t>
       </w:r>
     </w:p>
     <w:sectPr>

</xml_diff>

<commit_message>
Revisi cover: tambah logo UNINDRA di tengah, cover disederhanakan, font hitam, tabel dibuat kalem
</commit_message>
<xml_diff>
--- a/LAPORAN_FINAL/Laporan Wawancara Helper - Kelompok - Pengembangan Profesi Konseling - FINISH.docx
+++ b/LAPORAN_FINAL/Laporan Wawancara Helper - Kelompok - Pengembangan Profesi Konseling - FINISH.docx
@@ -4,35 +4,15 @@
   <w:body>
     <w:p>
       <w:pPr>
-        <w:spacing w:before="0" w:after="280" w:lineRule="auto" w:line="360"/>
+        <w:spacing w:before="360" w:after="240" w:lineRule="auto" w:line="360"/>
         <w:jc w:val="center"/>
-        <w:shd w:val="clear" w:fill="1F3A5F"/>
       </w:pPr>
       <w:r>
         <w:rPr>
           <w:rFonts w:ascii="Times New Roman" w:hAnsi="Times New Roman" w:eastAsia="Times New Roman"/>
           <w:b/>
           <w:i w:val="0"/>
-          <w:color w:val="FFFFFF"/>
-          <w:sz w:val="24"/>
-        </w:rPr>
-        <w:t>LAPORAN TUGAS MATA KULIAH PENGEMBANGAN PROFESI KONSELING</w:t>
-      </w:r>
-    </w:p>
-    <w:p>
-      <w:pPr>
-        <w:spacing w:before="360" w:after="200" w:lineRule="auto" w:line="360"/>
-        <w:jc w:val="center"/>
-        <w:pBdr>
-          <w:bottom w:val="single" w:sz="12" w:space="4" w:color="1F3A5F"/>
-        </w:pBdr>
-      </w:pPr>
-      <w:r>
-        <w:rPr>
-          <w:rFonts w:ascii="Times New Roman" w:hAnsi="Times New Roman" w:eastAsia="Times New Roman"/>
-          <w:b/>
-          <w:i w:val="0"/>
-          <w:color w:val="1F3A5F"/>
+          <w:color w:val="000000"/>
           <w:sz w:val="36"/>
         </w:rPr>
         <w:t>LAPORAN WAWANCARA DENGAN HELPER PEMBERI LAYANAN</w:t>
@@ -40,7 +20,7 @@
     </w:p>
     <w:p>
       <w:pPr>
-        <w:spacing w:before="120" w:after="400" w:lineRule="auto" w:line="360"/>
+        <w:spacing w:before="80" w:after="400" w:lineRule="auto" w:line="360"/>
         <w:jc w:val="center"/>
       </w:pPr>
       <w:r>
@@ -48,7 +28,7 @@
           <w:rFonts w:ascii="Times New Roman" w:hAnsi="Times New Roman" w:eastAsia="Times New Roman"/>
           <w:b w:val="0"/>
           <w:i/>
-          <w:color w:val="15293F"/>
+          <w:color w:val="000000"/>
           <w:sz w:val="25"/>
         </w:rPr>
         <w:t>Telaah Karakteristik dan Peran Helper pada Empat Bidang Layanan dalam Perspektif Pengembangan Profesi Konseling</w:t>
@@ -64,6 +44,7 @@
           <w:rFonts w:ascii="Times New Roman" w:hAnsi="Times New Roman" w:eastAsia="Times New Roman"/>
           <w:b w:val="0"/>
           <w:i w:val="0"/>
+          <w:color w:val="000000"/>
           <w:sz w:val="24"/>
         </w:rPr>
         <w:t>Disusun untuk memenuhi tugas mata kuliah</w:t>
@@ -79,6 +60,7 @@
           <w:rFonts w:ascii="Times New Roman" w:hAnsi="Times New Roman" w:eastAsia="Times New Roman"/>
           <w:b/>
           <w:i w:val="0"/>
+          <w:color w:val="000000"/>
           <w:sz w:val="24"/>
         </w:rPr>
         <w:t>Pengembangan Profesi Konseling</w:t>
@@ -86,7 +68,7 @@
     </w:p>
     <w:p>
       <w:pPr>
-        <w:spacing w:before="0" w:after="400" w:lineRule="auto" w:line="360"/>
+        <w:spacing w:before="0" w:after="360" w:lineRule="auto" w:line="360"/>
         <w:jc w:val="center"/>
       </w:pPr>
       <w:r>
@@ -94,6 +76,7 @@
           <w:rFonts w:ascii="Times New Roman" w:hAnsi="Times New Roman" w:eastAsia="Times New Roman"/>
           <w:b w:val="0"/>
           <w:i w:val="0"/>
+          <w:color w:val="000000"/>
           <w:sz w:val="24"/>
         </w:rPr>
         <w:t>Dosen Pengampu: Burju Ruth, M.Pd., Kons.</w:t>
@@ -101,18 +84,43 @@
     </w:p>
     <w:p>
       <w:pPr>
-        <w:spacing w:before="0" w:after="280" w:lineRule="auto" w:line="360"/>
+        <w:spacing w:before="40" w:after="360"/>
         <w:jc w:val="center"/>
-      </w:pPr>
-      <w:r>
-        <w:rPr>
-          <w:rFonts w:ascii="Times New Roman" w:hAnsi="Times New Roman" w:eastAsia="Times New Roman"/>
-          <w:b/>
-          <w:i w:val="0"/>
-          <w:color w:val="1F3A5F"/>
-          <w:sz w:val="26"/>
-        </w:rPr>
-        <w:t>UNIVERSITAS INDRAPRASTA PGRI</w:t>
+        <w:keepLines w:val="true"/>
+      </w:pPr>
+      <w:r>
+        <w:drawing>
+          <wp:inline xmlns:a="http://schemas.openxmlformats.org/drawingml/2006/main" xmlns:pic="http://schemas.openxmlformats.org/drawingml/2006/picture">
+            <wp:extent cx="1512000" cy="1512000"/>
+            <wp:docPr id="1" name="Picture 1"/>
+            <wp:cNvGraphicFramePr>
+              <a:graphicFrameLocks noChangeAspect="1"/>
+            </wp:cNvGraphicFramePr>
+            <a:graphic>
+              <a:graphicData uri="http://schemas.openxmlformats.org/drawingml/2006/picture">
+                <pic:pic>
+                  <pic:nvPicPr>
+                    <pic:cNvPr id="0" name="logo-unindra.jpg"/>
+                    <pic:cNvPicPr/>
+                  </pic:nvPicPr>
+                  <pic:blipFill>
+                    <a:blip r:embed="rId10"/>
+                    <a:stretch>
+                      <a:fillRect/>
+                    </a:stretch>
+                  </pic:blipFill>
+                  <pic:spPr>
+                    <a:xfrm>
+                      <a:off x="0" y="0"/>
+                      <a:ext cx="1512000" cy="1512000"/>
+                    </a:xfrm>
+                    <a:prstGeom prst="rect"/>
+                  </pic:spPr>
+                </pic:pic>
+              </a:graphicData>
+            </a:graphic>
+          </wp:inline>
+        </w:drawing>
       </w:r>
     </w:p>
     <w:p>
@@ -125,6 +133,7 @@
           <w:rFonts w:ascii="Times New Roman" w:hAnsi="Times New Roman" w:eastAsia="Times New Roman"/>
           <w:b/>
           <w:i w:val="0"/>
+          <w:color w:val="000000"/>
           <w:sz w:val="24"/>
         </w:rPr>
         <w:t>Disusun oleh:</w:t>
@@ -140,6 +149,7 @@
           <w:rFonts w:ascii="Times New Roman" w:hAnsi="Times New Roman" w:eastAsia="Times New Roman"/>
           <w:b/>
           <w:i w:val="0"/>
+          <w:color w:val="000000"/>
           <w:sz w:val="25"/>
         </w:rPr>
         <w:t>Nurul Syifa</w:t>
@@ -155,6 +165,7 @@
           <w:rFonts w:ascii="Times New Roman" w:hAnsi="Times New Roman" w:eastAsia="Times New Roman"/>
           <w:b w:val="0"/>
           <w:i w:val="0"/>
+          <w:color w:val="000000"/>
           <w:sz w:val="23"/>
         </w:rPr>
         <w:t>NIM. 202501500526</w:t>
@@ -170,6 +181,7 @@
           <w:rFonts w:ascii="Times New Roman" w:hAnsi="Times New Roman" w:eastAsia="Times New Roman"/>
           <w:b/>
           <w:i w:val="0"/>
+          <w:color w:val="000000"/>
           <w:sz w:val="25"/>
         </w:rPr>
         <w:t>Lidya Ellen Febriasalsa</w:t>
@@ -185,6 +197,7 @@
           <w:rFonts w:ascii="Times New Roman" w:hAnsi="Times New Roman" w:eastAsia="Times New Roman"/>
           <w:b w:val="0"/>
           <w:i w:val="0"/>
+          <w:color w:val="000000"/>
           <w:sz w:val="23"/>
         </w:rPr>
         <w:t>NIM. 202501500538</w:t>
@@ -200,6 +213,7 @@
           <w:rFonts w:ascii="Times New Roman" w:hAnsi="Times New Roman" w:eastAsia="Times New Roman"/>
           <w:b/>
           <w:i w:val="0"/>
+          <w:color w:val="000000"/>
           <w:sz w:val="25"/>
         </w:rPr>
         <w:t>Balqis Sandra Lejla</w:t>
@@ -215,6 +229,7 @@
           <w:rFonts w:ascii="Times New Roman" w:hAnsi="Times New Roman" w:eastAsia="Times New Roman"/>
           <w:b w:val="0"/>
           <w:i w:val="0"/>
+          <w:color w:val="000000"/>
           <w:sz w:val="23"/>
         </w:rPr>
         <w:t>NIM. 202501500525</w:t>
@@ -230,6 +245,7 @@
           <w:rFonts w:ascii="Times New Roman" w:hAnsi="Times New Roman" w:eastAsia="Times New Roman"/>
           <w:b/>
           <w:i w:val="0"/>
+          <w:color w:val="000000"/>
           <w:sz w:val="25"/>
         </w:rPr>
         <w:t>Devia Zahra</w:t>
@@ -245,6 +261,7 @@
           <w:rFonts w:ascii="Times New Roman" w:hAnsi="Times New Roman" w:eastAsia="Times New Roman"/>
           <w:b w:val="0"/>
           <w:i w:val="0"/>
+          <w:color w:val="000000"/>
           <w:sz w:val="23"/>
         </w:rPr>
         <w:t>NIM. 202501500511</w:t>
@@ -260,7 +277,7 @@
           <w:rFonts w:ascii="Times New Roman" w:hAnsi="Times New Roman" w:eastAsia="Times New Roman"/>
           <w:b/>
           <w:i w:val="0"/>
-          <w:color w:val="1F3A5F"/>
+          <w:color w:val="000000"/>
           <w:sz w:val="25"/>
         </w:rPr>
         <w:t>PROGRAM STUDI BIMBINGAN DAN KONSELING</w:t>
@@ -276,7 +293,7 @@
           <w:rFonts w:ascii="Times New Roman" w:hAnsi="Times New Roman" w:eastAsia="Times New Roman"/>
           <w:b/>
           <w:i w:val="0"/>
-          <w:color w:val="1F3A5F"/>
+          <w:color w:val="000000"/>
           <w:sz w:val="25"/>
         </w:rPr>
         <w:t>FAKULTAS ILMU PENDIDIKAN DAN PENGETAHUAN SOSIAL</w:t>
@@ -292,7 +309,7 @@
           <w:rFonts w:ascii="Times New Roman" w:hAnsi="Times New Roman" w:eastAsia="Times New Roman"/>
           <w:b/>
           <w:i w:val="0"/>
-          <w:color w:val="1F3A5F"/>
+          <w:color w:val="000000"/>
           <w:sz w:val="25"/>
         </w:rPr>
         <w:t>UNIVERSITAS INDRAPRASTA PGRI</w:t>
@@ -308,7 +325,7 @@
           <w:rFonts w:ascii="Times New Roman" w:hAnsi="Times New Roman" w:eastAsia="Times New Roman"/>
           <w:b/>
           <w:i w:val="0"/>
-          <w:color w:val="1F3A5F"/>
+          <w:color w:val="000000"/>
           <w:sz w:val="25"/>
         </w:rPr>
         <w:t>2026</w:t>
@@ -333,7 +350,7 @@
         <w:widowControl w:val="true"/>
         <w:keepLines w:val="true"/>
         <w:pBdr>
-          <w:bottom w:val="single" w:sz="12" w:space="4" w:color="1F3A5F"/>
+          <w:bottom w:val="single" w:sz="6" w:space="4" w:color="000000"/>
         </w:pBdr>
       </w:pPr>
       <w:r>
@@ -341,7 +358,7 @@
           <w:rFonts w:ascii="Times New Roman" w:hAnsi="Times New Roman" w:eastAsia="Times New Roman"/>
           <w:b/>
           <w:i w:val="0"/>
-          <w:color w:val="1F3A5F"/>
+          <w:color w:val="000000"/>
           <w:sz w:val="28"/>
         </w:rPr>
         <w:t>KATA PENGANTAR</w:t>
@@ -452,7 +469,7 @@
         <w:widowControl w:val="true"/>
         <w:keepLines w:val="true"/>
         <w:pBdr>
-          <w:bottom w:val="single" w:sz="12" w:space="4" w:color="1F3A5F"/>
+          <w:bottom w:val="single" w:sz="6" w:space="4" w:color="000000"/>
         </w:pBdr>
       </w:pPr>
       <w:r>
@@ -460,7 +477,7 @@
           <w:rFonts w:ascii="Times New Roman" w:hAnsi="Times New Roman" w:eastAsia="Times New Roman"/>
           <w:b/>
           <w:i w:val="0"/>
-          <w:color w:val="1F3A5F"/>
+          <w:color w:val="000000"/>
           <w:sz w:val="28"/>
         </w:rPr>
         <w:t>DAFTAR ISI</w:t>
@@ -1030,7 +1047,7 @@
           <w:rFonts w:ascii="Times New Roman" w:hAnsi="Times New Roman" w:eastAsia="Times New Roman"/>
           <w:b/>
           <w:i w:val="0"/>
-          <w:color w:val="1F3A5F"/>
+          <w:color w:val="000000"/>
           <w:sz w:val="28"/>
         </w:rPr>
         <w:t>BAB I</w:t>
@@ -1044,7 +1061,7 @@
         <w:widowControl w:val="true"/>
         <w:keepLines w:val="true"/>
         <w:pBdr>
-          <w:bottom w:val="single" w:sz="12" w:space="4" w:color="1F3A5F"/>
+          <w:bottom w:val="single" w:sz="6" w:space="4" w:color="000000"/>
         </w:pBdr>
       </w:pPr>
       <w:r>
@@ -1052,7 +1069,7 @@
           <w:rFonts w:ascii="Times New Roman" w:hAnsi="Times New Roman" w:eastAsia="Times New Roman"/>
           <w:b/>
           <w:i w:val="0"/>
-          <w:color w:val="1F3A5F"/>
+          <w:color w:val="000000"/>
           <w:sz w:val="28"/>
         </w:rPr>
         <w:t>PENDAHULUAN</w:t>
@@ -1071,7 +1088,7 @@
           <w:rFonts w:ascii="Times New Roman" w:hAnsi="Times New Roman" w:eastAsia="Times New Roman"/>
           <w:b/>
           <w:i w:val="0"/>
-          <w:color w:val="1F3A5F"/>
+          <w:color w:val="000000"/>
           <w:sz w:val="24"/>
         </w:rPr>
         <w:t>1.1 Latar Belakang</w:t>
@@ -1154,7 +1171,7 @@
           <w:rFonts w:ascii="Times New Roman" w:hAnsi="Times New Roman" w:eastAsia="Times New Roman"/>
           <w:b/>
           <w:i w:val="0"/>
-          <w:color w:val="1F3A5F"/>
+          <w:color w:val="000000"/>
           <w:sz w:val="24"/>
         </w:rPr>
         <w:t>1.2 Tujuan</w:t>
@@ -1274,7 +1291,7 @@
           <w:rFonts w:ascii="Times New Roman" w:hAnsi="Times New Roman" w:eastAsia="Times New Roman"/>
           <w:b/>
           <w:i w:val="0"/>
-          <w:color w:val="1F3A5F"/>
+          <w:color w:val="000000"/>
           <w:sz w:val="24"/>
         </w:rPr>
         <w:t>1.3 Manfaat</w:t>
@@ -1293,7 +1310,7 @@
           <w:rFonts w:ascii="Times New Roman" w:hAnsi="Times New Roman" w:eastAsia="Times New Roman"/>
           <w:b/>
           <w:i/>
-          <w:color w:val="15293F"/>
+          <w:color w:val="000000"/>
           <w:sz w:val="24"/>
         </w:rPr>
         <w:t>1.3.1 Manfaat Teoretis</w:t>
@@ -1328,7 +1345,7 @@
           <w:rFonts w:ascii="Times New Roman" w:hAnsi="Times New Roman" w:eastAsia="Times New Roman"/>
           <w:b/>
           <w:i/>
-          <w:color w:val="15293F"/>
+          <w:color w:val="000000"/>
           <w:sz w:val="24"/>
         </w:rPr>
         <w:t>1.3.2 Manfaat Praktis</w:t>
@@ -1364,7 +1381,7 @@
           <w:rFonts w:ascii="Times New Roman" w:hAnsi="Times New Roman" w:eastAsia="Times New Roman"/>
           <w:b/>
           <w:i w:val="0"/>
-          <w:color w:val="1F3A5F"/>
+          <w:color w:val="000000"/>
           <w:sz w:val="28"/>
         </w:rPr>
         <w:t>BAB II</w:t>
@@ -1378,7 +1395,7 @@
         <w:widowControl w:val="true"/>
         <w:keepLines w:val="true"/>
         <w:pBdr>
-          <w:bottom w:val="single" w:sz="12" w:space="4" w:color="1F3A5F"/>
+          <w:bottom w:val="single" w:sz="6" w:space="4" w:color="000000"/>
         </w:pBdr>
       </w:pPr>
       <w:r>
@@ -1386,7 +1403,7 @@
           <w:rFonts w:ascii="Times New Roman" w:hAnsi="Times New Roman" w:eastAsia="Times New Roman"/>
           <w:b/>
           <w:i w:val="0"/>
-          <w:color w:val="1F3A5F"/>
+          <w:color w:val="000000"/>
           <w:sz w:val="28"/>
         </w:rPr>
         <w:t>LANDASAN TEORI</w:t>
@@ -1405,7 +1422,7 @@
           <w:rFonts w:ascii="Times New Roman" w:hAnsi="Times New Roman" w:eastAsia="Times New Roman"/>
           <w:b/>
           <w:i w:val="0"/>
-          <w:color w:val="1F3A5F"/>
+          <w:color w:val="000000"/>
           <w:sz w:val="24"/>
         </w:rPr>
         <w:t>2.1 Pengertian Helper</w:t>
@@ -1472,7 +1489,7 @@
           <w:rFonts w:ascii="Times New Roman" w:hAnsi="Times New Roman" w:eastAsia="Times New Roman"/>
           <w:b/>
           <w:i w:val="0"/>
-          <w:color w:val="1F3A5F"/>
+          <w:color w:val="000000"/>
           <w:sz w:val="24"/>
         </w:rPr>
         <w:t>2.2 Karakteristik Helper yang Efektif</w:t>
@@ -1507,7 +1524,7 @@
           <w:rFonts w:ascii="Times New Roman" w:hAnsi="Times New Roman" w:eastAsia="Times New Roman"/>
           <w:b/>
           <w:i/>
-          <w:color w:val="15293F"/>
+          <w:color w:val="000000"/>
           <w:sz w:val="24"/>
         </w:rPr>
         <w:t>2.2.1 Pandangan Carl Rogers</w:t>
@@ -1542,7 +1559,7 @@
           <w:rFonts w:ascii="Times New Roman" w:hAnsi="Times New Roman" w:eastAsia="Times New Roman"/>
           <w:b/>
           <w:i/>
-          <w:color w:val="15293F"/>
+          <w:color w:val="000000"/>
           <w:sz w:val="24"/>
         </w:rPr>
         <w:t>2.2.2 Pandangan Gerald Corey</w:t>
@@ -1577,7 +1594,7 @@
           <w:rFonts w:ascii="Times New Roman" w:hAnsi="Times New Roman" w:eastAsia="Times New Roman"/>
           <w:b/>
           <w:i/>
-          <w:color w:val="15293F"/>
+          <w:color w:val="000000"/>
           <w:sz w:val="24"/>
         </w:rPr>
         <w:t>2.2.3 Pandangan Lawrence Brammer</w:t>
@@ -1628,7 +1645,7 @@
           <w:rFonts w:ascii="Times New Roman" w:hAnsi="Times New Roman" w:eastAsia="Times New Roman"/>
           <w:b/>
           <w:i w:val="0"/>
-          <w:color w:val="1F3A5F"/>
+          <w:color w:val="000000"/>
           <w:sz w:val="24"/>
         </w:rPr>
         <w:t>2.3 Peran Helper dalam Layanan</w:t>
@@ -1680,7 +1697,7 @@
           <w:rFonts w:ascii="Times New Roman" w:hAnsi="Times New Roman" w:eastAsia="Times New Roman"/>
           <w:b/>
           <w:i w:val="0"/>
-          <w:color w:val="1F3A5F"/>
+          <w:color w:val="000000"/>
           <w:sz w:val="28"/>
         </w:rPr>
         <w:t>BAB III</w:t>
@@ -1694,7 +1711,7 @@
         <w:widowControl w:val="true"/>
         <w:keepLines w:val="true"/>
         <w:pBdr>
-          <w:bottom w:val="single" w:sz="12" w:space="4" w:color="1F3A5F"/>
+          <w:bottom w:val="single" w:sz="6" w:space="4" w:color="000000"/>
         </w:pBdr>
       </w:pPr>
       <w:r>
@@ -1702,7 +1719,7 @@
           <w:rFonts w:ascii="Times New Roman" w:hAnsi="Times New Roman" w:eastAsia="Times New Roman"/>
           <w:b/>
           <w:i w:val="0"/>
-          <w:color w:val="1F3A5F"/>
+          <w:color w:val="000000"/>
           <w:sz w:val="28"/>
         </w:rPr>
         <w:t>METODE KEGIATAN</w:t>
@@ -1721,7 +1738,7 @@
           <w:rFonts w:ascii="Times New Roman" w:hAnsi="Times New Roman" w:eastAsia="Times New Roman"/>
           <w:b/>
           <w:i w:val="0"/>
-          <w:color w:val="1F3A5F"/>
+          <w:color w:val="000000"/>
           <w:sz w:val="24"/>
         </w:rPr>
         <w:t>3.1 Jenis Kegiatan</w:t>
@@ -1756,7 +1773,7 @@
           <w:rFonts w:ascii="Times New Roman" w:hAnsi="Times New Roman" w:eastAsia="Times New Roman"/>
           <w:b/>
           <w:i w:val="0"/>
-          <w:color w:val="1F3A5F"/>
+          <w:color w:val="000000"/>
           <w:sz w:val="24"/>
         </w:rPr>
         <w:t>3.2 Subjek Wawancara</w:t>
@@ -1789,7 +1806,7 @@
           <w:rFonts w:ascii="Times New Roman" w:hAnsi="Times New Roman" w:eastAsia="Times New Roman"/>
           <w:b w:val="0"/>
           <w:i/>
-          <w:color w:val="1F3A5F"/>
+          <w:color w:val="000000"/>
           <w:sz w:val="22"/>
         </w:rPr>
         <w:t>Tabel 3.1 Profil singkat subjek wawancara</w:t>
@@ -1801,12 +1818,12 @@
         <w:jc w:val="center"/>
         <w:tblLook w:firstColumn="1" w:firstRow="1" w:lastColumn="0" w:lastRow="0" w:noHBand="0" w:noVBand="1" w:val="04A0"/>
         <w:tblBorders>
-          <w:top w:val="single" w:sz="6" w:color="6F86AD"/>
-          <w:left w:val="single" w:sz="6" w:color="6F86AD"/>
-          <w:bottom w:val="single" w:sz="6" w:color="6F86AD"/>
-          <w:right w:val="single" w:sz="6" w:color="6F86AD"/>
-          <w:insideH w:val="single" w:sz="6" w:color="6F86AD"/>
-          <w:insideV w:val="single" w:sz="6" w:color="6F86AD"/>
+          <w:top w:val="single" w:sz="4" w:color="CCCCCC"/>
+          <w:left w:val="single" w:sz="4" w:color="CCCCCC"/>
+          <w:bottom w:val="single" w:sz="4" w:color="CCCCCC"/>
+          <w:right w:val="single" w:sz="4" w:color="CCCCCC"/>
+          <w:insideH w:val="single" w:sz="4" w:color="CCCCCC"/>
+          <w:insideV w:val="single" w:sz="4" w:color="CCCCCC"/>
         </w:tblBorders>
       </w:tblPr>
       <w:tblGrid>
@@ -1824,7 +1841,7 @@
         <w:tc>
           <w:tcPr>
             <w:tcW w:type="dxa" w:w="1587"/>
-            <w:shd w:val="clear" w:fill="1F3A5F"/>
+            <w:shd w:val="clear" w:fill="ECECEC"/>
           </w:tcPr>
           <w:p>
             <w:pPr>
@@ -1835,7 +1852,7 @@
                 <w:rFonts w:ascii="Times New Roman" w:hAnsi="Times New Roman" w:eastAsia="Times New Roman"/>
                 <w:b/>
                 <w:i w:val="0"/>
-                <w:color w:val="FFFFFF"/>
+                <w:color w:val="000000"/>
                 <w:sz w:val="22"/>
               </w:rPr>
               <w:t>Kode</w:t>
@@ -1845,7 +1862,7 @@
         <w:tc>
           <w:tcPr>
             <w:tcW w:type="dxa" w:w="1587"/>
-            <w:shd w:val="clear" w:fill="1F3A5F"/>
+            <w:shd w:val="clear" w:fill="ECECEC"/>
           </w:tcPr>
           <w:p>
             <w:pPr>
@@ -1856,7 +1873,7 @@
                 <w:rFonts w:ascii="Times New Roman" w:hAnsi="Times New Roman" w:eastAsia="Times New Roman"/>
                 <w:b/>
                 <w:i w:val="0"/>
-                <w:color w:val="FFFFFF"/>
+                <w:color w:val="000000"/>
                 <w:sz w:val="22"/>
               </w:rPr>
               <w:t>Nama</w:t>
@@ -1866,7 +1883,7 @@
         <w:tc>
           <w:tcPr>
             <w:tcW w:type="dxa" w:w="1587"/>
-            <w:shd w:val="clear" w:fill="1F3A5F"/>
+            <w:shd w:val="clear" w:fill="ECECEC"/>
           </w:tcPr>
           <w:p>
             <w:pPr>
@@ -1877,7 +1894,7 @@
                 <w:rFonts w:ascii="Times New Roman" w:hAnsi="Times New Roman" w:eastAsia="Times New Roman"/>
                 <w:b/>
                 <w:i w:val="0"/>
-                <w:color w:val="FFFFFF"/>
+                <w:color w:val="000000"/>
                 <w:sz w:val="22"/>
               </w:rPr>
               <w:t>Profesi</w:t>
@@ -1887,7 +1904,7 @@
         <w:tc>
           <w:tcPr>
             <w:tcW w:type="dxa" w:w="1587"/>
-            <w:shd w:val="clear" w:fill="1F3A5F"/>
+            <w:shd w:val="clear" w:fill="ECECEC"/>
           </w:tcPr>
           <w:p>
             <w:pPr>
@@ -1898,7 +1915,7 @@
                 <w:rFonts w:ascii="Times New Roman" w:hAnsi="Times New Roman" w:eastAsia="Times New Roman"/>
                 <w:b/>
                 <w:i w:val="0"/>
-                <w:color w:val="FFFFFF"/>
+                <w:color w:val="000000"/>
                 <w:sz w:val="22"/>
               </w:rPr>
               <w:t>Tempat Bertugas</w:t>
@@ -1908,7 +1925,7 @@
         <w:tc>
           <w:tcPr>
             <w:tcW w:type="dxa" w:w="1587"/>
-            <w:shd w:val="clear" w:fill="1F3A5F"/>
+            <w:shd w:val="clear" w:fill="ECECEC"/>
           </w:tcPr>
           <w:p>
             <w:pPr>
@@ -1919,7 +1936,7 @@
                 <w:rFonts w:ascii="Times New Roman" w:hAnsi="Times New Roman" w:eastAsia="Times New Roman"/>
                 <w:b/>
                 <w:i w:val="0"/>
-                <w:color w:val="FFFFFF"/>
+                <w:color w:val="000000"/>
                 <w:sz w:val="22"/>
               </w:rPr>
               <w:t>Pengalaman</w:t>
@@ -2034,7 +2051,7 @@
         <w:tc>
           <w:tcPr>
             <w:tcW w:type="dxa" w:w="1587"/>
-            <w:shd w:val="clear" w:fill="F2F5FA"/>
+            <w:shd w:val="clear" w:fill="F7F7F7"/>
           </w:tcPr>
           <w:p>
             <w:pPr>
@@ -2054,7 +2071,7 @@
         <w:tc>
           <w:tcPr>
             <w:tcW w:type="dxa" w:w="1587"/>
-            <w:shd w:val="clear" w:fill="F2F5FA"/>
+            <w:shd w:val="clear" w:fill="F7F7F7"/>
           </w:tcPr>
           <w:p>
             <w:pPr>
@@ -2074,7 +2091,7 @@
         <w:tc>
           <w:tcPr>
             <w:tcW w:type="dxa" w:w="1587"/>
-            <w:shd w:val="clear" w:fill="F2F5FA"/>
+            <w:shd w:val="clear" w:fill="F7F7F7"/>
           </w:tcPr>
           <w:p>
             <w:pPr>
@@ -2094,7 +2111,7 @@
         <w:tc>
           <w:tcPr>
             <w:tcW w:type="dxa" w:w="1587"/>
-            <w:shd w:val="clear" w:fill="F2F5FA"/>
+            <w:shd w:val="clear" w:fill="F7F7F7"/>
           </w:tcPr>
           <w:p>
             <w:pPr>
@@ -2114,7 +2131,7 @@
         <w:tc>
           <w:tcPr>
             <w:tcW w:type="dxa" w:w="1587"/>
-            <w:shd w:val="clear" w:fill="F2F5FA"/>
+            <w:shd w:val="clear" w:fill="F7F7F7"/>
           </w:tcPr>
           <w:p>
             <w:pPr>
@@ -2239,7 +2256,7 @@
         <w:tc>
           <w:tcPr>
             <w:tcW w:type="dxa" w:w="1587"/>
-            <w:shd w:val="clear" w:fill="F2F5FA"/>
+            <w:shd w:val="clear" w:fill="F7F7F7"/>
           </w:tcPr>
           <w:p>
             <w:pPr>
@@ -2259,7 +2276,7 @@
         <w:tc>
           <w:tcPr>
             <w:tcW w:type="dxa" w:w="1587"/>
-            <w:shd w:val="clear" w:fill="F2F5FA"/>
+            <w:shd w:val="clear" w:fill="F7F7F7"/>
           </w:tcPr>
           <w:p>
             <w:pPr>
@@ -2279,7 +2296,7 @@
         <w:tc>
           <w:tcPr>
             <w:tcW w:type="dxa" w:w="1587"/>
-            <w:shd w:val="clear" w:fill="F2F5FA"/>
+            <w:shd w:val="clear" w:fill="F7F7F7"/>
           </w:tcPr>
           <w:p>
             <w:pPr>
@@ -2299,7 +2316,7 @@
         <w:tc>
           <w:tcPr>
             <w:tcW w:type="dxa" w:w="1587"/>
-            <w:shd w:val="clear" w:fill="F2F5FA"/>
+            <w:shd w:val="clear" w:fill="F7F7F7"/>
           </w:tcPr>
           <w:p>
             <w:pPr>
@@ -2319,7 +2336,7 @@
         <w:tc>
           <w:tcPr>
             <w:tcW w:type="dxa" w:w="1587"/>
-            <w:shd w:val="clear" w:fill="F2F5FA"/>
+            <w:shd w:val="clear" w:fill="F7F7F7"/>
           </w:tcPr>
           <w:p>
             <w:pPr>
@@ -2372,7 +2389,7 @@
           <w:rFonts w:ascii="Times New Roman" w:hAnsi="Times New Roman" w:eastAsia="Times New Roman"/>
           <w:b/>
           <w:i w:val="0"/>
-          <w:color w:val="1F3A5F"/>
+          <w:color w:val="000000"/>
           <w:sz w:val="24"/>
         </w:rPr>
         <w:t>3.3 Teknik Pengumpulan Data</w:t>
@@ -2407,7 +2424,7 @@
           <w:rFonts w:ascii="Times New Roman" w:hAnsi="Times New Roman" w:eastAsia="Times New Roman"/>
           <w:b/>
           <w:i w:val="0"/>
-          <w:color w:val="1F3A5F"/>
+          <w:color w:val="000000"/>
           <w:sz w:val="24"/>
         </w:rPr>
         <w:t>3.4 Instrumen Wawancara</w:t>
@@ -2442,7 +2459,7 @@
           <w:rFonts w:ascii="Times New Roman" w:hAnsi="Times New Roman" w:eastAsia="Times New Roman"/>
           <w:b/>
           <w:i w:val="0"/>
-          <w:color w:val="1F3A5F"/>
+          <w:color w:val="000000"/>
           <w:sz w:val="24"/>
         </w:rPr>
         <w:t>3.5 Waktu dan Tempat Kegiatan</w:t>
@@ -2478,7 +2495,7 @@
           <w:rFonts w:ascii="Times New Roman" w:hAnsi="Times New Roman" w:eastAsia="Times New Roman"/>
           <w:b/>
           <w:i w:val="0"/>
-          <w:color w:val="1F3A5F"/>
+          <w:color w:val="000000"/>
           <w:sz w:val="28"/>
         </w:rPr>
         <w:t>BAB IV</w:t>
@@ -2492,7 +2509,7 @@
         <w:widowControl w:val="true"/>
         <w:keepLines w:val="true"/>
         <w:pBdr>
-          <w:bottom w:val="single" w:sz="12" w:space="4" w:color="1F3A5F"/>
+          <w:bottom w:val="single" w:sz="6" w:space="4" w:color="000000"/>
         </w:pBdr>
       </w:pPr>
       <w:r>
@@ -2500,7 +2517,7 @@
           <w:rFonts w:ascii="Times New Roman" w:hAnsi="Times New Roman" w:eastAsia="Times New Roman"/>
           <w:b/>
           <w:i w:val="0"/>
-          <w:color w:val="1F3A5F"/>
+          <w:color w:val="000000"/>
           <w:sz w:val="28"/>
         </w:rPr>
         <w:t>HASIL WAWANCARA DAN PEMBAHASAN</w:t>
@@ -2535,7 +2552,7 @@
           <w:rFonts w:ascii="Times New Roman" w:hAnsi="Times New Roman" w:eastAsia="Times New Roman"/>
           <w:b/>
           <w:i w:val="0"/>
-          <w:color w:val="1F3A5F"/>
+          <w:color w:val="000000"/>
           <w:sz w:val="24"/>
         </w:rPr>
         <w:t>4.1 Hasil Wawancara Helper A (TNI Angkatan Darat)</w:t>
@@ -2788,9 +2805,9 @@
         <w:jc w:val="both"/>
         <w:widowControl w:val="true"/>
         <w:keepLines w:val="true"/>
-        <w:shd w:val="clear" w:fill="EEF2F8"/>
+        <w:shd w:val="clear" w:fill="F7F7F7"/>
         <w:pBdr>
-          <w:left w:val="single" w:sz="24" w:space="6" w:color="1F3A5F"/>
+          <w:left w:val="single" w:sz="18" w:space="6" w:color="CCCCCC"/>
         </w:pBdr>
       </w:pPr>
       <w:r>
@@ -2816,7 +2833,7 @@
           <w:rFonts w:ascii="Times New Roman" w:hAnsi="Times New Roman" w:eastAsia="Times New Roman"/>
           <w:b/>
           <w:i w:val="0"/>
-          <w:color w:val="1F3A5F"/>
+          <w:color w:val="000000"/>
           <w:sz w:val="24"/>
         </w:rPr>
         <w:t>4.2 Hasil Wawancara Helper B (Petugas Pemadam Kebakaran)</w:t>
@@ -3069,9 +3086,9 @@
         <w:jc w:val="both"/>
         <w:widowControl w:val="true"/>
         <w:keepLines w:val="true"/>
-        <w:shd w:val="clear" w:fill="EEF2F8"/>
+        <w:shd w:val="clear" w:fill="F7F7F7"/>
         <w:pBdr>
-          <w:left w:val="single" w:sz="24" w:space="6" w:color="1F3A5F"/>
+          <w:left w:val="single" w:sz="18" w:space="6" w:color="CCCCCC"/>
         </w:pBdr>
       </w:pPr>
       <w:r>
@@ -3097,7 +3114,7 @@
           <w:rFonts w:ascii="Times New Roman" w:hAnsi="Times New Roman" w:eastAsia="Times New Roman"/>
           <w:b/>
           <w:i w:val="0"/>
-          <w:color w:val="1F3A5F"/>
+          <w:color w:val="000000"/>
           <w:sz w:val="24"/>
         </w:rPr>
         <w:t>4.3 Hasil Wawancara Helper C (Bidan)</w:t>
@@ -3350,9 +3367,9 @@
         <w:jc w:val="both"/>
         <w:widowControl w:val="true"/>
         <w:keepLines w:val="true"/>
-        <w:shd w:val="clear" w:fill="EEF2F8"/>
+        <w:shd w:val="clear" w:fill="F7F7F7"/>
         <w:pBdr>
-          <w:left w:val="single" w:sz="24" w:space="6" w:color="1F3A5F"/>
+          <w:left w:val="single" w:sz="18" w:space="6" w:color="CCCCCC"/>
         </w:pBdr>
       </w:pPr>
       <w:r>
@@ -3378,7 +3395,7 @@
           <w:rFonts w:ascii="Times New Roman" w:hAnsi="Times New Roman" w:eastAsia="Times New Roman"/>
           <w:b/>
           <w:i w:val="0"/>
-          <w:color w:val="1F3A5F"/>
+          <w:color w:val="000000"/>
           <w:sz w:val="24"/>
         </w:rPr>
         <w:t>4.4 Hasil Wawancara Helper D (Guru Bimbingan dan Konseling)</w:t>
@@ -3631,9 +3648,9 @@
         <w:jc w:val="both"/>
         <w:widowControl w:val="true"/>
         <w:keepLines w:val="true"/>
-        <w:shd w:val="clear" w:fill="EEF2F8"/>
+        <w:shd w:val="clear" w:fill="F7F7F7"/>
         <w:pBdr>
-          <w:left w:val="single" w:sz="24" w:space="6" w:color="1F3A5F"/>
+          <w:left w:val="single" w:sz="18" w:space="6" w:color="CCCCCC"/>
         </w:pBdr>
       </w:pPr>
       <w:r>
@@ -3659,7 +3676,7 @@
           <w:rFonts w:ascii="Times New Roman" w:hAnsi="Times New Roman" w:eastAsia="Times New Roman"/>
           <w:b/>
           <w:i w:val="0"/>
-          <w:color w:val="1F3A5F"/>
+          <w:color w:val="000000"/>
           <w:sz w:val="24"/>
         </w:rPr>
         <w:t>4.5 Pembahasan</w:t>
@@ -3694,7 +3711,7 @@
           <w:rFonts w:ascii="Times New Roman" w:hAnsi="Times New Roman" w:eastAsia="Times New Roman"/>
           <w:b/>
           <w:i/>
-          <w:color w:val="15293F"/>
+          <w:color w:val="000000"/>
           <w:sz w:val="24"/>
         </w:rPr>
         <w:t>4.5.1 Persamaan Hasil Wawancara</w:t>
@@ -3729,7 +3746,7 @@
           <w:rFonts w:ascii="Times New Roman" w:hAnsi="Times New Roman" w:eastAsia="Times New Roman"/>
           <w:b/>
           <w:i/>
-          <w:color w:val="15293F"/>
+          <w:color w:val="000000"/>
           <w:sz w:val="24"/>
         </w:rPr>
         <w:t>4.5.2 Perbedaan Pengalaman Helper</w:t>
@@ -3764,7 +3781,7 @@
           <w:rFonts w:ascii="Times New Roman" w:hAnsi="Times New Roman" w:eastAsia="Times New Roman"/>
           <w:b/>
           <w:i/>
-          <w:color w:val="15293F"/>
+          <w:color w:val="000000"/>
           <w:sz w:val="24"/>
         </w:rPr>
         <w:t>4.5.3 Keterampilan Kunci yang Muncul</w:t>
@@ -3799,7 +3816,7 @@
           <w:rFonts w:ascii="Times New Roman" w:hAnsi="Times New Roman" w:eastAsia="Times New Roman"/>
           <w:b/>
           <w:i/>
-          <w:color w:val="15293F"/>
+          <w:color w:val="000000"/>
           <w:sz w:val="24"/>
         </w:rPr>
         <w:t>4.5.4 Kaitan dengan Teori Helper</w:t>
@@ -3832,7 +3849,7 @@
           <w:rFonts w:ascii="Times New Roman" w:hAnsi="Times New Roman" w:eastAsia="Times New Roman"/>
           <w:b w:val="0"/>
           <w:i/>
-          <w:color w:val="1F3A5F"/>
+          <w:color w:val="000000"/>
           <w:sz w:val="22"/>
         </w:rPr>
         <w:t>Tabel 4.1 Ringkasan hasil wawancara empat helper</w:t>
@@ -3844,12 +3861,12 @@
         <w:jc w:val="center"/>
         <w:tblLook w:firstColumn="1" w:firstRow="1" w:lastColumn="0" w:lastRow="0" w:noHBand="0" w:noVBand="1" w:val="04A0"/>
         <w:tblBorders>
-          <w:top w:val="single" w:sz="6" w:color="6F86AD"/>
-          <w:left w:val="single" w:sz="6" w:color="6F86AD"/>
-          <w:bottom w:val="single" w:sz="6" w:color="6F86AD"/>
-          <w:right w:val="single" w:sz="6" w:color="6F86AD"/>
-          <w:insideH w:val="single" w:sz="6" w:color="6F86AD"/>
-          <w:insideV w:val="single" w:sz="6" w:color="6F86AD"/>
+          <w:top w:val="single" w:sz="4" w:color="CCCCCC"/>
+          <w:left w:val="single" w:sz="4" w:color="CCCCCC"/>
+          <w:bottom w:val="single" w:sz="4" w:color="CCCCCC"/>
+          <w:right w:val="single" w:sz="4" w:color="CCCCCC"/>
+          <w:insideH w:val="single" w:sz="4" w:color="CCCCCC"/>
+          <w:insideV w:val="single" w:sz="4" w:color="CCCCCC"/>
         </w:tblBorders>
       </w:tblPr>
       <w:tblGrid>
@@ -3867,7 +3884,7 @@
         <w:tc>
           <w:tcPr>
             <w:tcW w:type="dxa" w:w="1587"/>
-            <w:shd w:val="clear" w:fill="1F3A5F"/>
+            <w:shd w:val="clear" w:fill="ECECEC"/>
           </w:tcPr>
           <w:p>
             <w:pPr>
@@ -3878,7 +3895,7 @@
                 <w:rFonts w:ascii="Times New Roman" w:hAnsi="Times New Roman" w:eastAsia="Times New Roman"/>
                 <w:b/>
                 <w:i w:val="0"/>
-                <w:color w:val="FFFFFF"/>
+                <w:color w:val="000000"/>
                 <w:sz w:val="22"/>
               </w:rPr>
               <w:t>Aspek</w:t>
@@ -3888,7 +3905,7 @@
         <w:tc>
           <w:tcPr>
             <w:tcW w:type="dxa" w:w="1587"/>
-            <w:shd w:val="clear" w:fill="1F3A5F"/>
+            <w:shd w:val="clear" w:fill="ECECEC"/>
           </w:tcPr>
           <w:p>
             <w:pPr>
@@ -3899,7 +3916,7 @@
                 <w:rFonts w:ascii="Times New Roman" w:hAnsi="Times New Roman" w:eastAsia="Times New Roman"/>
                 <w:b/>
                 <w:i w:val="0"/>
-                <w:color w:val="FFFFFF"/>
+                <w:color w:val="000000"/>
                 <w:sz w:val="22"/>
               </w:rPr>
               <w:t>Helper A (TNI AD)</w:t>
@@ -3909,7 +3926,7 @@
         <w:tc>
           <w:tcPr>
             <w:tcW w:type="dxa" w:w="1587"/>
-            <w:shd w:val="clear" w:fill="1F3A5F"/>
+            <w:shd w:val="clear" w:fill="ECECEC"/>
           </w:tcPr>
           <w:p>
             <w:pPr>
@@ -3920,7 +3937,7 @@
                 <w:rFonts w:ascii="Times New Roman" w:hAnsi="Times New Roman" w:eastAsia="Times New Roman"/>
                 <w:b/>
                 <w:i w:val="0"/>
-                <w:color w:val="FFFFFF"/>
+                <w:color w:val="000000"/>
                 <w:sz w:val="22"/>
               </w:rPr>
               <w:t>Helper B (Pemadam)</w:t>
@@ -3930,7 +3947,7 @@
         <w:tc>
           <w:tcPr>
             <w:tcW w:type="dxa" w:w="1587"/>
-            <w:shd w:val="clear" w:fill="1F3A5F"/>
+            <w:shd w:val="clear" w:fill="ECECEC"/>
           </w:tcPr>
           <w:p>
             <w:pPr>
@@ -3941,7 +3958,7 @@
                 <w:rFonts w:ascii="Times New Roman" w:hAnsi="Times New Roman" w:eastAsia="Times New Roman"/>
                 <w:b/>
                 <w:i w:val="0"/>
-                <w:color w:val="FFFFFF"/>
+                <w:color w:val="000000"/>
                 <w:sz w:val="22"/>
               </w:rPr>
               <w:t>Helper C (Bidan)</w:t>
@@ -3951,7 +3968,7 @@
         <w:tc>
           <w:tcPr>
             <w:tcW w:type="dxa" w:w="1587"/>
-            <w:shd w:val="clear" w:fill="1F3A5F"/>
+            <w:shd w:val="clear" w:fill="ECECEC"/>
           </w:tcPr>
           <w:p>
             <w:pPr>
@@ -3962,7 +3979,7 @@
                 <w:rFonts w:ascii="Times New Roman" w:hAnsi="Times New Roman" w:eastAsia="Times New Roman"/>
                 <w:b/>
                 <w:i w:val="0"/>
-                <w:color w:val="FFFFFF"/>
+                <w:color w:val="000000"/>
                 <w:sz w:val="22"/>
               </w:rPr>
               <w:t>Helper D (Guru BK)</w:t>
@@ -4077,7 +4094,7 @@
         <w:tc>
           <w:tcPr>
             <w:tcW w:type="dxa" w:w="1587"/>
-            <w:shd w:val="clear" w:fill="F2F5FA"/>
+            <w:shd w:val="clear" w:fill="F7F7F7"/>
           </w:tcPr>
           <w:p>
             <w:pPr>
@@ -4097,7 +4114,7 @@
         <w:tc>
           <w:tcPr>
             <w:tcW w:type="dxa" w:w="1587"/>
-            <w:shd w:val="clear" w:fill="F2F5FA"/>
+            <w:shd w:val="clear" w:fill="F7F7F7"/>
           </w:tcPr>
           <w:p>
             <w:pPr>
@@ -4117,7 +4134,7 @@
         <w:tc>
           <w:tcPr>
             <w:tcW w:type="dxa" w:w="1587"/>
-            <w:shd w:val="clear" w:fill="F2F5FA"/>
+            <w:shd w:val="clear" w:fill="F7F7F7"/>
           </w:tcPr>
           <w:p>
             <w:pPr>
@@ -4137,7 +4154,7 @@
         <w:tc>
           <w:tcPr>
             <w:tcW w:type="dxa" w:w="1587"/>
-            <w:shd w:val="clear" w:fill="F2F5FA"/>
+            <w:shd w:val="clear" w:fill="F7F7F7"/>
           </w:tcPr>
           <w:p>
             <w:pPr>
@@ -4157,7 +4174,7 @@
         <w:tc>
           <w:tcPr>
             <w:tcW w:type="dxa" w:w="1587"/>
-            <w:shd w:val="clear" w:fill="F2F5FA"/>
+            <w:shd w:val="clear" w:fill="F7F7F7"/>
           </w:tcPr>
           <w:p>
             <w:pPr>
@@ -4282,7 +4299,7 @@
         <w:tc>
           <w:tcPr>
             <w:tcW w:type="dxa" w:w="1587"/>
-            <w:shd w:val="clear" w:fill="F2F5FA"/>
+            <w:shd w:val="clear" w:fill="F7F7F7"/>
           </w:tcPr>
           <w:p>
             <w:pPr>
@@ -4302,7 +4319,7 @@
         <w:tc>
           <w:tcPr>
             <w:tcW w:type="dxa" w:w="1587"/>
-            <w:shd w:val="clear" w:fill="F2F5FA"/>
+            <w:shd w:val="clear" w:fill="F7F7F7"/>
           </w:tcPr>
           <w:p>
             <w:pPr>
@@ -4322,7 +4339,7 @@
         <w:tc>
           <w:tcPr>
             <w:tcW w:type="dxa" w:w="1587"/>
-            <w:shd w:val="clear" w:fill="F2F5FA"/>
+            <w:shd w:val="clear" w:fill="F7F7F7"/>
           </w:tcPr>
           <w:p>
             <w:pPr>
@@ -4342,7 +4359,7 @@
         <w:tc>
           <w:tcPr>
             <w:tcW w:type="dxa" w:w="1587"/>
-            <w:shd w:val="clear" w:fill="F2F5FA"/>
+            <w:shd w:val="clear" w:fill="F7F7F7"/>
           </w:tcPr>
           <w:p>
             <w:pPr>
@@ -4362,7 +4379,7 @@
         <w:tc>
           <w:tcPr>
             <w:tcW w:type="dxa" w:w="1587"/>
-            <w:shd w:val="clear" w:fill="F2F5FA"/>
+            <w:shd w:val="clear" w:fill="F7F7F7"/>
           </w:tcPr>
           <w:p>
             <w:pPr>
@@ -4516,7 +4533,7 @@
           <w:rFonts w:ascii="Times New Roman" w:hAnsi="Times New Roman" w:eastAsia="Times New Roman"/>
           <w:b/>
           <w:i w:val="0"/>
-          <w:color w:val="1F3A5F"/>
+          <w:color w:val="000000"/>
           <w:sz w:val="28"/>
         </w:rPr>
         <w:t>BAB V</w:t>
@@ -4530,7 +4547,7 @@
         <w:widowControl w:val="true"/>
         <w:keepLines w:val="true"/>
         <w:pBdr>
-          <w:bottom w:val="single" w:sz="12" w:space="4" w:color="1F3A5F"/>
+          <w:bottom w:val="single" w:sz="6" w:space="4" w:color="000000"/>
         </w:pBdr>
       </w:pPr>
       <w:r>
@@ -4538,7 +4555,7 @@
           <w:rFonts w:ascii="Times New Roman" w:hAnsi="Times New Roman" w:eastAsia="Times New Roman"/>
           <w:b/>
           <w:i w:val="0"/>
-          <w:color w:val="1F3A5F"/>
+          <w:color w:val="000000"/>
           <w:sz w:val="28"/>
         </w:rPr>
         <w:t>PENUTUP</w:t>
@@ -4557,7 +4574,7 @@
           <w:rFonts w:ascii="Times New Roman" w:hAnsi="Times New Roman" w:eastAsia="Times New Roman"/>
           <w:b/>
           <w:i w:val="0"/>
-          <w:color w:val="1F3A5F"/>
+          <w:color w:val="000000"/>
           <w:sz w:val="24"/>
         </w:rPr>
         <w:t>5.1 Kesimpulan</w:t>
@@ -4608,7 +4625,7 @@
           <w:rFonts w:ascii="Times New Roman" w:hAnsi="Times New Roman" w:eastAsia="Times New Roman"/>
           <w:b/>
           <w:i w:val="0"/>
-          <w:color w:val="1F3A5F"/>
+          <w:color w:val="000000"/>
           <w:sz w:val="24"/>
         </w:rPr>
         <w:t>5.2 Saran</w:t>
@@ -4707,7 +4724,7 @@
         <w:widowControl w:val="true"/>
         <w:keepLines w:val="true"/>
         <w:pBdr>
-          <w:bottom w:val="single" w:sz="12" w:space="4" w:color="1F3A5F"/>
+          <w:bottom w:val="single" w:sz="6" w:space="4" w:color="000000"/>
         </w:pBdr>
       </w:pPr>
       <w:r>
@@ -4715,7 +4732,7 @@
           <w:rFonts w:ascii="Times New Roman" w:hAnsi="Times New Roman" w:eastAsia="Times New Roman"/>
           <w:b/>
           <w:i w:val="0"/>
-          <w:color w:val="1F3A5F"/>
+          <w:color w:val="000000"/>
           <w:sz w:val="28"/>
         </w:rPr>
         <w:t>DAFTAR PUSTAKA</w:t>
@@ -4849,7 +4866,7 @@
         <w:widowControl w:val="true"/>
         <w:keepLines w:val="true"/>
         <w:pBdr>
-          <w:bottom w:val="single" w:sz="12" w:space="4" w:color="1F3A5F"/>
+          <w:bottom w:val="single" w:sz="6" w:space="4" w:color="000000"/>
         </w:pBdr>
       </w:pPr>
       <w:r>
@@ -4857,7 +4874,7 @@
           <w:rFonts w:ascii="Times New Roman" w:hAnsi="Times New Roman" w:eastAsia="Times New Roman"/>
           <w:b/>
           <w:i w:val="0"/>
-          <w:color w:val="1F3A5F"/>
+          <w:color w:val="000000"/>
           <w:sz w:val="28"/>
         </w:rPr>
         <w:t>LAMPIRAN 1: DAFTAR PERTANYAAN WAWANCARA</w:t>
@@ -5143,7 +5160,7 @@
         <w:widowControl w:val="true"/>
         <w:keepLines w:val="true"/>
         <w:pBdr>
-          <w:bottom w:val="single" w:sz="12" w:space="4" w:color="1F3A5F"/>
+          <w:bottom w:val="single" w:sz="6" w:space="4" w:color="000000"/>
         </w:pBdr>
       </w:pPr>
       <w:r>
@@ -5151,7 +5168,7 @@
           <w:rFonts w:ascii="Times New Roman" w:hAnsi="Times New Roman" w:eastAsia="Times New Roman"/>
           <w:b/>
           <w:i w:val="0"/>
-          <w:color w:val="1F3A5F"/>
+          <w:color w:val="000000"/>
           <w:sz w:val="28"/>
         </w:rPr>
         <w:t>LAMPIRAN 2: TRANSKRIP WAWANCARA</w:t>
@@ -5170,7 +5187,7 @@
           <w:rFonts w:ascii="Times New Roman" w:hAnsi="Times New Roman" w:eastAsia="Times New Roman"/>
           <w:b/>
           <w:i w:val="0"/>
-          <w:color w:val="1F3A5F"/>
+          <w:color w:val="000000"/>
           <w:sz w:val="24"/>
         </w:rPr>
         <w:t>Transkrip Helper A: Lukman Hidayat (TNI Angkatan Darat)</w:t>
@@ -5669,7 +5686,7 @@
           <w:rFonts w:ascii="Times New Roman" w:hAnsi="Times New Roman" w:eastAsia="Times New Roman"/>
           <w:b/>
           <w:i w:val="0"/>
-          <w:color w:val="1F3A5F"/>
+          <w:color w:val="000000"/>
           <w:sz w:val="24"/>
         </w:rPr>
         <w:t>Transkrip Helper B: Rinno (Petugas Pemadam Kebakaran)</w:t>
@@ -6168,7 +6185,7 @@
           <w:rFonts w:ascii="Times New Roman" w:hAnsi="Times New Roman" w:eastAsia="Times New Roman"/>
           <w:b/>
           <w:i w:val="0"/>
-          <w:color w:val="1F3A5F"/>
+          <w:color w:val="000000"/>
           <w:sz w:val="24"/>
         </w:rPr>
         <w:t>Transkrip Helper C: Priska Ayu Anjastari (Bidan)</w:t>
@@ -6667,7 +6684,7 @@
           <w:rFonts w:ascii="Times New Roman" w:hAnsi="Times New Roman" w:eastAsia="Times New Roman"/>
           <w:b/>
           <w:i w:val="0"/>
-          <w:color w:val="1F3A5F"/>
+          <w:color w:val="000000"/>
           <w:sz w:val="24"/>
         </w:rPr>
         <w:t>Transkrip Helper D: Elisabeth Suwartini (Guru Bimbingan dan Konseling)</w:t>
@@ -7162,7 +7179,7 @@
         <w:widowControl w:val="true"/>
         <w:keepLines w:val="true"/>
         <w:pBdr>
-          <w:bottom w:val="single" w:sz="12" w:space="4" w:color="1F3A5F"/>
+          <w:bottom w:val="single" w:sz="6" w:space="4" w:color="000000"/>
         </w:pBdr>
       </w:pPr>
       <w:r>
@@ -7170,7 +7187,7 @@
           <w:rFonts w:ascii="Times New Roman" w:hAnsi="Times New Roman" w:eastAsia="Times New Roman"/>
           <w:b/>
           <w:i w:val="0"/>
-          <w:color w:val="1F3A5F"/>
+          <w:color w:val="000000"/>
           <w:sz w:val="28"/>
         </w:rPr>
         <w:t>LAMPIRAN 3: DOKUMENTASI KEGIATAN</w:t>
@@ -7202,7 +7219,7 @@
         <w:drawing>
           <wp:inline xmlns:a="http://schemas.openxmlformats.org/drawingml/2006/main" xmlns:pic="http://schemas.openxmlformats.org/drawingml/2006/picture">
             <wp:extent cx="3600000" cy="4800000"/>
-            <wp:docPr id="1" name="Picture 1"/>
+            <wp:docPr id="2" name="Picture 2"/>
             <wp:cNvGraphicFramePr>
               <a:graphicFrameLocks noChangeAspect="1"/>
             </wp:cNvGraphicFramePr>
@@ -7214,7 +7231,7 @@
                     <pic:cNvPicPr/>
                   </pic:nvPicPr>
                   <pic:blipFill>
-                    <a:blip r:embed="rId11"/>
+                    <a:blip r:embed="rId12"/>
                     <a:stretch>
                       <a:fillRect/>
                     </a:stretch>
@@ -7258,7 +7275,7 @@
         <w:drawing>
           <wp:inline xmlns:a="http://schemas.openxmlformats.org/drawingml/2006/main" xmlns:pic="http://schemas.openxmlformats.org/drawingml/2006/picture">
             <wp:extent cx="3600000" cy="2106562"/>
-            <wp:docPr id="2" name="Picture 2"/>
+            <wp:docPr id="3" name="Picture 3"/>
             <wp:cNvGraphicFramePr>
               <a:graphicFrameLocks noChangeAspect="1"/>
             </wp:cNvGraphicFramePr>
@@ -7270,7 +7287,7 @@
                     <pic:cNvPicPr/>
                   </pic:nvPicPr>
                   <pic:blipFill>
-                    <a:blip r:embed="rId12"/>
+                    <a:blip r:embed="rId13"/>
                     <a:stretch>
                       <a:fillRect/>
                     </a:stretch>
@@ -7314,7 +7331,7 @@
         <w:drawing>
           <wp:inline xmlns:a="http://schemas.openxmlformats.org/drawingml/2006/main" xmlns:pic="http://schemas.openxmlformats.org/drawingml/2006/picture">
             <wp:extent cx="3600000" cy="6400000"/>
-            <wp:docPr id="3" name="Picture 3"/>
+            <wp:docPr id="4" name="Picture 4"/>
             <wp:cNvGraphicFramePr>
               <a:graphicFrameLocks noChangeAspect="1"/>
             </wp:cNvGraphicFramePr>
@@ -7326,7 +7343,7 @@
                     <pic:cNvPicPr/>
                   </pic:nvPicPr>
                   <pic:blipFill>
-                    <a:blip r:embed="rId13"/>
+                    <a:blip r:embed="rId14"/>
                     <a:stretch>
                       <a:fillRect/>
                     </a:stretch>
@@ -7370,7 +7387,7 @@
         <w:drawing>
           <wp:inline xmlns:a="http://schemas.openxmlformats.org/drawingml/2006/main" xmlns:pic="http://schemas.openxmlformats.org/drawingml/2006/picture">
             <wp:extent cx="3600000" cy="4800000"/>
-            <wp:docPr id="4" name="Picture 4"/>
+            <wp:docPr id="5" name="Picture 5"/>
             <wp:cNvGraphicFramePr>
               <a:graphicFrameLocks noChangeAspect="1"/>
             </wp:cNvGraphicFramePr>
@@ -7382,7 +7399,7 @@
                     <pic:cNvPicPr/>
                   </pic:nvPicPr>
                   <pic:blipFill>
-                    <a:blip r:embed="rId14"/>
+                    <a:blip r:embed="rId15"/>
                     <a:stretch>
                       <a:fillRect/>
                     </a:stretch>
@@ -7417,7 +7434,7 @@
       </w:r>
     </w:p>
     <w:sectPr>
-      <w:footerReference w:type="default" r:id="rId10"/>
+      <w:footerReference w:type="default" r:id="rId11"/>
       <w:pgSz w:w="11906" w:h="16838"/>
       <w:pgMar w:top="1701" w:right="1701" w:bottom="1701" w:left="2268" w:header="720" w:footer="720" w:gutter="0"/>
       <w:cols w:space="720"/>

</xml_diff>

<commit_message>
Perbaiki Daftar Isi agar muat satu halaman + cek QA halaman hampir kosong
</commit_message>
<xml_diff>
--- a/LAPORAN_FINAL/Laporan Wawancara Helper - Kelompok - Pengembangan Profesi Konseling - FINISH.docx
+++ b/LAPORAN_FINAL/Laporan Wawancara Helper - Kelompok - Pengembangan Profesi Konseling - FINISH.docx
@@ -488,7 +488,7 @@
         <w:tabs>
           <w:tab w:pos="7937" w:val="right" w:leader="dot"/>
         </w:tabs>
-        <w:spacing w:lineRule="auto" w:line="312" w:after="100"/>
+        <w:spacing w:lineRule="auto" w:line="269" w:after="40"/>
       </w:pPr>
       <w:r>
         <w:rPr>
@@ -507,7 +507,7 @@
         <w:tabs>
           <w:tab w:pos="7937" w:val="right" w:leader="dot"/>
         </w:tabs>
-        <w:spacing w:lineRule="auto" w:line="312" w:after="100"/>
+        <w:spacing w:lineRule="auto" w:line="269" w:after="40"/>
       </w:pPr>
       <w:r>
         <w:rPr>
@@ -526,7 +526,7 @@
         <w:tabs>
           <w:tab w:pos="7937" w:val="right" w:leader="dot"/>
         </w:tabs>
-        <w:spacing w:lineRule="auto" w:line="312" w:after="40"/>
+        <w:spacing w:lineRule="auto" w:line="269" w:after="20"/>
         <w:ind w:left="510"/>
       </w:pPr>
       <w:r>
@@ -546,7 +546,7 @@
         <w:tabs>
           <w:tab w:pos="7937" w:val="right" w:leader="dot"/>
         </w:tabs>
-        <w:spacing w:lineRule="auto" w:line="312" w:after="40"/>
+        <w:spacing w:lineRule="auto" w:line="269" w:after="20"/>
         <w:ind w:left="510"/>
       </w:pPr>
       <w:r>
@@ -566,7 +566,7 @@
         <w:tabs>
           <w:tab w:pos="7937" w:val="right" w:leader="dot"/>
         </w:tabs>
-        <w:spacing w:lineRule="auto" w:line="312" w:after="40"/>
+        <w:spacing w:lineRule="auto" w:line="269" w:after="20"/>
         <w:ind w:left="510"/>
       </w:pPr>
       <w:r>
@@ -586,7 +586,7 @@
         <w:tabs>
           <w:tab w:pos="7937" w:val="right" w:leader="dot"/>
         </w:tabs>
-        <w:spacing w:lineRule="auto" w:line="312" w:after="100"/>
+        <w:spacing w:lineRule="auto" w:line="269" w:after="40"/>
       </w:pPr>
       <w:r>
         <w:rPr>
@@ -605,7 +605,7 @@
         <w:tabs>
           <w:tab w:pos="7937" w:val="right" w:leader="dot"/>
         </w:tabs>
-        <w:spacing w:lineRule="auto" w:line="312" w:after="40"/>
+        <w:spacing w:lineRule="auto" w:line="269" w:after="20"/>
         <w:ind w:left="510"/>
       </w:pPr>
       <w:r>
@@ -625,7 +625,7 @@
         <w:tabs>
           <w:tab w:pos="7937" w:val="right" w:leader="dot"/>
         </w:tabs>
-        <w:spacing w:lineRule="auto" w:line="312" w:after="40"/>
+        <w:spacing w:lineRule="auto" w:line="269" w:after="20"/>
         <w:ind w:left="510"/>
       </w:pPr>
       <w:r>
@@ -645,7 +645,7 @@
         <w:tabs>
           <w:tab w:pos="7937" w:val="right" w:leader="dot"/>
         </w:tabs>
-        <w:spacing w:lineRule="auto" w:line="312" w:after="40"/>
+        <w:spacing w:lineRule="auto" w:line="269" w:after="20"/>
         <w:ind w:left="510"/>
       </w:pPr>
       <w:r>
@@ -665,7 +665,7 @@
         <w:tabs>
           <w:tab w:pos="7937" w:val="right" w:leader="dot"/>
         </w:tabs>
-        <w:spacing w:lineRule="auto" w:line="312" w:after="100"/>
+        <w:spacing w:lineRule="auto" w:line="269" w:after="40"/>
       </w:pPr>
       <w:r>
         <w:rPr>
@@ -684,7 +684,7 @@
         <w:tabs>
           <w:tab w:pos="7937" w:val="right" w:leader="dot"/>
         </w:tabs>
-        <w:spacing w:lineRule="auto" w:line="312" w:after="40"/>
+        <w:spacing w:lineRule="auto" w:line="269" w:after="20"/>
         <w:ind w:left="510"/>
       </w:pPr>
       <w:r>
@@ -704,7 +704,7 @@
         <w:tabs>
           <w:tab w:pos="7937" w:val="right" w:leader="dot"/>
         </w:tabs>
-        <w:spacing w:lineRule="auto" w:line="312" w:after="40"/>
+        <w:spacing w:lineRule="auto" w:line="269" w:after="20"/>
         <w:ind w:left="510"/>
       </w:pPr>
       <w:r>
@@ -724,7 +724,7 @@
         <w:tabs>
           <w:tab w:pos="7937" w:val="right" w:leader="dot"/>
         </w:tabs>
-        <w:spacing w:lineRule="auto" w:line="312" w:after="40"/>
+        <w:spacing w:lineRule="auto" w:line="269" w:after="20"/>
         <w:ind w:left="510"/>
       </w:pPr>
       <w:r>
@@ -744,7 +744,7 @@
         <w:tabs>
           <w:tab w:pos="7937" w:val="right" w:leader="dot"/>
         </w:tabs>
-        <w:spacing w:lineRule="auto" w:line="312" w:after="40"/>
+        <w:spacing w:lineRule="auto" w:line="269" w:after="20"/>
         <w:ind w:left="510"/>
       </w:pPr>
       <w:r>
@@ -764,7 +764,7 @@
         <w:tabs>
           <w:tab w:pos="7937" w:val="right" w:leader="dot"/>
         </w:tabs>
-        <w:spacing w:lineRule="auto" w:line="312" w:after="40"/>
+        <w:spacing w:lineRule="auto" w:line="269" w:after="20"/>
         <w:ind w:left="510"/>
       </w:pPr>
       <w:r>
@@ -784,7 +784,7 @@
         <w:tabs>
           <w:tab w:pos="7937" w:val="right" w:leader="dot"/>
         </w:tabs>
-        <w:spacing w:lineRule="auto" w:line="312" w:after="100"/>
+        <w:spacing w:lineRule="auto" w:line="269" w:after="40"/>
       </w:pPr>
       <w:r>
         <w:rPr>
@@ -803,7 +803,7 @@
         <w:tabs>
           <w:tab w:pos="7937" w:val="right" w:leader="dot"/>
         </w:tabs>
-        <w:spacing w:lineRule="auto" w:line="312" w:after="40"/>
+        <w:spacing w:lineRule="auto" w:line="269" w:after="20"/>
         <w:ind w:left="510"/>
       </w:pPr>
       <w:r>
@@ -823,7 +823,7 @@
         <w:tabs>
           <w:tab w:pos="7937" w:val="right" w:leader="dot"/>
         </w:tabs>
-        <w:spacing w:lineRule="auto" w:line="312" w:after="40"/>
+        <w:spacing w:lineRule="auto" w:line="269" w:after="20"/>
         <w:ind w:left="510"/>
       </w:pPr>
       <w:r>
@@ -843,7 +843,7 @@
         <w:tabs>
           <w:tab w:pos="7937" w:val="right" w:leader="dot"/>
         </w:tabs>
-        <w:spacing w:lineRule="auto" w:line="312" w:after="40"/>
+        <w:spacing w:lineRule="auto" w:line="269" w:after="20"/>
         <w:ind w:left="510"/>
       </w:pPr>
       <w:r>
@@ -863,7 +863,7 @@
         <w:tabs>
           <w:tab w:pos="7937" w:val="right" w:leader="dot"/>
         </w:tabs>
-        <w:spacing w:lineRule="auto" w:line="312" w:after="40"/>
+        <w:spacing w:lineRule="auto" w:line="269" w:after="20"/>
         <w:ind w:left="510"/>
       </w:pPr>
       <w:r>
@@ -883,7 +883,7 @@
         <w:tabs>
           <w:tab w:pos="7937" w:val="right" w:leader="dot"/>
         </w:tabs>
-        <w:spacing w:lineRule="auto" w:line="312" w:after="40"/>
+        <w:spacing w:lineRule="auto" w:line="269" w:after="20"/>
         <w:ind w:left="510"/>
       </w:pPr>
       <w:r>
@@ -903,7 +903,7 @@
         <w:tabs>
           <w:tab w:pos="7937" w:val="right" w:leader="dot"/>
         </w:tabs>
-        <w:spacing w:lineRule="auto" w:line="312" w:after="100"/>
+        <w:spacing w:lineRule="auto" w:line="269" w:after="40"/>
       </w:pPr>
       <w:r>
         <w:rPr>
@@ -922,7 +922,7 @@
         <w:tabs>
           <w:tab w:pos="7937" w:val="right" w:leader="dot"/>
         </w:tabs>
-        <w:spacing w:lineRule="auto" w:line="312" w:after="40"/>
+        <w:spacing w:lineRule="auto" w:line="269" w:after="20"/>
         <w:ind w:left="510"/>
       </w:pPr>
       <w:r>
@@ -942,7 +942,7 @@
         <w:tabs>
           <w:tab w:pos="7937" w:val="right" w:leader="dot"/>
         </w:tabs>
-        <w:spacing w:lineRule="auto" w:line="312" w:after="40"/>
+        <w:spacing w:lineRule="auto" w:line="269" w:after="20"/>
         <w:ind w:left="510"/>
       </w:pPr>
       <w:r>
@@ -962,7 +962,7 @@
         <w:tabs>
           <w:tab w:pos="7937" w:val="right" w:leader="dot"/>
         </w:tabs>
-        <w:spacing w:lineRule="auto" w:line="312" w:after="100"/>
+        <w:spacing w:lineRule="auto" w:line="269" w:after="40"/>
       </w:pPr>
       <w:r>
         <w:rPr>
@@ -981,7 +981,7 @@
         <w:tabs>
           <w:tab w:pos="7937" w:val="right" w:leader="dot"/>
         </w:tabs>
-        <w:spacing w:lineRule="auto" w:line="312" w:after="100"/>
+        <w:spacing w:lineRule="auto" w:line="269" w:after="40"/>
       </w:pPr>
       <w:r>
         <w:rPr>
@@ -1000,7 +1000,7 @@
         <w:tabs>
           <w:tab w:pos="7937" w:val="right" w:leader="dot"/>
         </w:tabs>
-        <w:spacing w:lineRule="auto" w:line="312" w:after="100"/>
+        <w:spacing w:lineRule="auto" w:line="269" w:after="40"/>
       </w:pPr>
       <w:r>
         <w:rPr>
@@ -1019,7 +1019,7 @@
         <w:tabs>
           <w:tab w:pos="7937" w:val="right" w:leader="dot"/>
         </w:tabs>
-        <w:spacing w:lineRule="auto" w:line="312" w:after="100"/>
+        <w:spacing w:lineRule="auto" w:line="269" w:after="40"/>
       </w:pPr>
       <w:r>
         <w:rPr>
@@ -1030,7 +1030,7 @@
         </w:rPr>
         <w:t>LAMPIRAN 3: Dokumentasi Kegiatan</w:t>
         <w:tab/>
-        <w:t>4</w:t>
+        <w:t>3</w:t>
       </w:r>
     </w:p>
     <w:p>

</xml_diff>

<commit_message>
QC final: cocokkan ke instruksi dosen + standar tim, perbaiki temuan
</commit_message>
<xml_diff>
--- a/LAPORAN_FINAL/Laporan Wawancara Helper - Kelompok - Pengembangan Profesi Konseling - FINISH.docx
+++ b/LAPORAN_FINAL/Laporan Wawancara Helper - Kelompok - Pengembangan Profesi Konseling - FINISH.docx
@@ -912,7 +912,7 @@
           <w:i w:val="0"/>
           <w:sz w:val="24"/>
         </w:rPr>
-        <w:t>BAB V  PENUTUP</w:t>
+        <w:t>BAB V  KESIMPULAN DAN SARAN</w:t>
         <w:tab/>
         <w:t>3</w:t>
       </w:r>
@@ -4558,7 +4558,7 @@
           <w:color w:val="000000"/>
           <w:sz w:val="28"/>
         </w:rPr>
-        <w:t>PENUTUP</w:t>
+        <w:t>KESIMPULAN DAN SARAN</w:t>
       </w:r>
     </w:p>
     <w:p>
@@ -4769,7 +4769,7 @@
           <w:i w:val="0"/>
           <w:sz w:val="24"/>
         </w:rPr>
-        <w:t>Corey, G. (2017). Theory and practice of counseling and psychotherapy (10th ed.). Cengage Learning. https://www.cengage.com/c/student/9780357671429/</w:t>
+        <w:t>Corey, G. (2017). Theory and practice of counseling and psychotherapy (10th ed.). Cengage Learning. https://openlibrary.org/works/OL21156W/Theory_and_practice_of_counseling_and_psychotherapy</w:t>
       </w:r>
     </w:p>
     <w:p>

</xml_diff>